<commit_message>
Manuel de formation : chapitre 3 (clients) ; deux phrases d'écran corrigées (2.101.305)
Chapitre 3 « Clients » du manuel opérationnel, 13 pages, 12 rubriques et fiche
de validation : 🙋 Créer un client, 👤 Clients, le renvoi des accès, le mot de
fidélité, ce que le client voit dans son espace. Chaque bouton vient du code.

En l'écrivant, deux phrases qui mentaient à l'écran :
- 👥 Utilisateurs annonçait un mot de passe client « 4 derniers chiffres +
  2 premières lettres » — l'algorithme d'avant la 2.98.68 ; c'est un mélange
  de 6 caractères (lib/identiteClient.js). Le chapitre 2 l'avait recopiée :
  corrigé aux deux endroits.
- 🙋 Créer un client écrivait « WhatsApp s'est ouvert avec le message » en
  dur, faux depuis que les accès partent du numéro BMI (2.101.304) : le cadre
  vert dit maintenant par où le message est parti.

Co-Authored-By: Claude Fable 5.1 <noreply@anthropic.com>
Claude-Session: https://claude.ai/code/session_01V9FfE1ccQN1sKVjUyrAC9z
</commit_message>
<xml_diff>
--- a/docs/manuel/chapitre-01-connexion-securite-et-navigation.docx
+++ b/docs/manuel/chapitre-01-connexion-securite-et-navigation.docx
@@ -322,7 +322,7 @@
                 <w:sz w:val="20"/>
                 <w:szCs w:val="20"/>
               </w:rPr>
-              <w:t xml:space="preserve">2.101.303</w:t>
+              <w:t xml:space="preserve">2.101.305</w:t>
             </w:r>
           </w:p>
         </w:tc>
@@ -8569,7 +8569,7 @@
         <w:sz w:val="14"/>
         <w:szCs w:val="14"/>
       </w:rPr>
-      <w:t xml:space="preserve">Version 2.101.303 de l'application  ·  22 septembre 2026  ·  document interne BMI Togo</w:t>
+      <w:t xml:space="preserve">Version 2.101.305 de l'application  ·  22 septembre 2026  ·  document interne BMI Togo</w:t>
     </w:r>
   </w:p>
 </w:ftr>

</xml_diff>

<commit_message>
Manuel de formation : chapitre 5 (ventes et commandes)
Chapitre « Ventes et commandes » du manuel opérationnel, 15 pages, 12 rubriques
et fiche de validation : le panier, l'encaissement au comptant et à crédit, la
proforma et « 🛒 Vendre », les trois chemins quand le stock manque, la liste et
la recette, les boutons ronds (📋 🔁 ↩ 🗑), et la commande d'un commercial
(🛒 Nouvelle commande → 📥 Commandes reçues). Chaque bouton vient du code.

Numéroté 5, sa place dans le plan retenu (le 4 est « Prospects », à écrire).
La fiche de validation garde ses signatures sur sa page (keepNext, case
d'observations un peu moins haute) : à neuf critères, elles partaient seules
sur une page.

Co-Authored-By: Claude Fable 5.1 <noreply@anthropic.com>
Claude-Session: https://claude.ai/code/session_01V9FfE1ccQN1sKVjUyrAC9z
</commit_message>
<xml_diff>
--- a/docs/manuel/chapitre-01-connexion-securite-et-navigation.docx
+++ b/docs/manuel/chapitre-01-connexion-securite-et-navigation.docx
@@ -8346,7 +8346,7 @@
       </w:tblGrid>
       <w:tr>
         <w:trPr>
-          <w:trHeight w:val="1700" w:hRule="atLeast"/>
+          <w:trHeight w:val="1400" w:hRule="atLeast"/>
         </w:trPr>
         <w:tc>
           <w:tcPr>
@@ -8380,7 +8380,8 @@
     </w:p>
     <w:p>
       <w:pPr>
-        <w:spacing w:after="300"/>
+        <w:keepNext/>
+        <w:spacing w:after="240"/>
       </w:pPr>
       <w:r>
         <w:rPr>

</xml_diff>

<commit_message>
Manuel de formation : chapitre 4 (prospects) ; une phrase d'écran corrigée (2.101.306)
Chapitre 4 « Prospects » du manuel opérationnel, 12 pages, 12 rubriques et
fiche de validation : enregistrer un prospect, le tableau de bord commercial,
🔔 À relancer, 📱 Relancer, 📞 Contacté, les dormants (150 jours), archiver
avec un motif, ✅ Convertir en client, la conversion automatique à
l'encaissement, réassigner. Chaque bouton vient du code.

Une phrase de 🧲 Prospects mentait : « Demandez à l'administrateur d'en créer
dans Paramètres » — les catégories de prospects se gèrent dans 🧲 Prospects
même (cadre « Catégories de prospects »). Corrigée.

Co-Authored-By: Claude Fable 5.1 <noreply@anthropic.com>
Claude-Session: https://claude.ai/code/session_01V9FfE1ccQN1sKVjUyrAC9z
</commit_message>
<xml_diff>
--- a/docs/manuel/chapitre-01-connexion-securite-et-navigation.docx
+++ b/docs/manuel/chapitre-01-connexion-securite-et-navigation.docx
@@ -322,7 +322,7 @@
                 <w:sz w:val="20"/>
                 <w:szCs w:val="20"/>
               </w:rPr>
-              <w:t xml:space="preserve">2.101.305</w:t>
+              <w:t xml:space="preserve">2.101.306</w:t>
             </w:r>
           </w:p>
         </w:tc>
@@ -8570,7 +8570,7 @@
         <w:sz w:val="14"/>
         <w:szCs w:val="14"/>
       </w:rPr>
-      <w:t xml:space="preserve">Version 2.101.305 de l'application  ·  22 septembre 2026  ·  document interne BMI Togo</w:t>
+      <w:t xml:space="preserve">Version 2.101.306 de l'application  ·  22 septembre 2026  ·  document interne BMI Togo</w:t>
     </w:r>
   </w:p>
 </w:ftr>

</xml_diff>

<commit_message>
Manuel de formation : chapitre 9 (ravitaillement et transferts)
Douze rubriques et fiche de validation, écrites d'après Ravitaillement.jsx,
la partie magasin de Stocks.jsx, le choix « Stock insuffisant » de Ventes.jsx,
lib/transfertsStock.js, notifications.js et le bon imprimé : qui valide, et
à quel instant le stock bouge, pour chacun des trois chemins.

Dans les cellules de tableau, « ⇄ » et « ⏳ » sortaient en carré vide à la
conversion PDF (chapitre 8 compris) : remplacés par le mot. Date du manuel
au 23 septembre 2026.

Co-Authored-By: Claude Fable 5.1 <noreply@anthropic.com>
Claude-Session: https://claude.ai/code/session_01V9FfE1ccQN1sKVjUyrAC9z
</commit_message>
<xml_diff>
--- a/docs/manuel/chapitre-01-connexion-securite-et-navigation.docx
+++ b/docs/manuel/chapitre-01-connexion-securite-et-navigation.docx
@@ -368,7 +368,7 @@
                 <w:sz w:val="20"/>
                 <w:szCs w:val="20"/>
               </w:rPr>
-              <w:t xml:space="preserve">22 septembre 2026</w:t>
+              <w:t xml:space="preserve">23 septembre 2026</w:t>
             </w:r>
           </w:p>
         </w:tc>
@@ -8570,7 +8570,7 @@
         <w:sz w:val="14"/>
         <w:szCs w:val="14"/>
       </w:rPr>
-      <w:t xml:space="preserve">Version 2.101.306 de l'application  ·  22 septembre 2026  ·  document interne BMI Togo</w:t>
+      <w:t xml:space="preserve">Version 2.101.306 de l'application  ·  23 septembre 2026  ·  document interne BMI Togo</w:t>
     </w:r>
   </w:p>
 </w:ftr>

</xml_diff>

<commit_message>
📖 Manuel — chapitre 10 : Fournisseurs et entrées de stock ; une phrase d'écran corrigée (2.101.311)
- scripts/manuel/chapitre-10.mjs, d'après Fournisseurs.jsx, la part
  fournisseur et les entrées de Stocks.jsx, lib/importStock.js,
  lib/calculs.js : douze rubriques, fiche de validation ; Word + PDF dans
  docs/manuel, manuel complet à dix chapitres.
- 🚚 Fournisseurs : le refus d'un règlement trop élevé renvoyait à un bouton
  « + Dette » qui n'existe pas — il s'appelle « + Commande ». Phrase
  corrigée ; le contrôle du banc qui exigeait l'ancienne phrase est retourné.
- CLAUDE.md : l'état du manuel (chapitre 10 remis, 11 à 25 à écrire), et le
  point à dire à Timo (un règlement de fournisseur ne passe pas par la
  validation du DG).

Co-Authored-By: Claude Fable 5.1 <noreply@anthropic.com>
Claude-Session: https://claude.ai/code/session_01V9FfE1ccQN1sKVjUyrAC9z
</commit_message>
<xml_diff>
--- a/docs/manuel/chapitre-01-connexion-securite-et-navigation.docx
+++ b/docs/manuel/chapitre-01-connexion-securite-et-navigation.docx
@@ -322,7 +322,7 @@
                 <w:sz w:val="20"/>
                 <w:szCs w:val="20"/>
               </w:rPr>
-              <w:t xml:space="preserve">2.101.306</w:t>
+              <w:t xml:space="preserve">2.101.311</w:t>
             </w:r>
           </w:p>
         </w:tc>
@@ -8570,7 +8570,7 @@
         <w:sz w:val="14"/>
         <w:szCs w:val="14"/>
       </w:rPr>
-      <w:t xml:space="preserve">Version 2.101.306 de l'application  ·  23 septembre 2026  ·  document interne BMI Togo</w:t>
+      <w:t xml:space="preserve">Version 2.101.311 de l'application  ·  23 septembre 2026  ·  document interne BMI Togo</w:t>
     </w:r>
   </w:p>
 </w:ftr>

</xml_diff>

<commit_message>
Manuel de formation : chapitre 11, dimensionnement solaire (2.101.346)
Besoins du client, les quatre chiffres du calcul, le choix du matériel dans
le stock, la fixation en barres, la fin du devis, l'envoi, les brouillons et
la conversion en vente. Le cas pratique chiffré est calculé avec
lib/solaire.js. La date du manuel passe au 25/09/2026.

Co-Authored-By: Claude Opus 5.5 <noreply@anthropic.com>
Claude-Session: https://claude.ai/code/session_01V9FfE1ccQN1sKVjUyrAC9z
</commit_message>
<xml_diff>
--- a/docs/manuel/chapitre-01-connexion-securite-et-navigation.docx
+++ b/docs/manuel/chapitre-01-connexion-securite-et-navigation.docx
@@ -322,7 +322,7 @@
                 <w:sz w:val="20"/>
                 <w:szCs w:val="20"/>
               </w:rPr>
-              <w:t xml:space="preserve">2.101.311</w:t>
+              <w:t xml:space="preserve">2.101.346</w:t>
             </w:r>
           </w:p>
         </w:tc>
@@ -368,7 +368,7 @@
                 <w:sz w:val="20"/>
                 <w:szCs w:val="20"/>
               </w:rPr>
-              <w:t xml:space="preserve">23 septembre 2026</w:t>
+              <w:t xml:space="preserve">25 septembre 2026</w:t>
             </w:r>
           </w:p>
         </w:tc>
@@ -8570,7 +8570,7 @@
         <w:sz w:val="14"/>
         <w:szCs w:val="14"/>
       </w:rPr>
-      <w:t xml:space="preserve">Version 2.101.311 de l'application  ·  23 septembre 2026  ·  document interne BMI Togo</w:t>
+      <w:t xml:space="preserve">Version 2.101.346 de l'application  ·  25 septembre 2026  ·  document interne BMI Togo</w:t>
     </w:r>
   </w:p>
 </w:ftr>

</xml_diff>

<commit_message>
Manuel de formation : chapitre 12 (Portail et devis sans calcul) — 2.101.358
Écrit d'après le code : volet Garage (type, poids majoré selon l'usage,
catégorie de moteur, crémaillère largeur + 1 m, accessoires, porte au m²,
kit solaire et batterie de secours), volets sans calcul (besoin du client
puis article proposé, le métier en tête, le reste du stock dessous) et
l'étude « Quelle pompe pour ce forage ? » (niveau dynamique, jamais un
débit promis). Cas pratiques calculés par les règles de l'application.

Deux phrases d'écran trompeuses corrigées en relisant :
- Paramètres : un domaine créé apparaît tout de suite dans le
  dimensionnement (et non « à la prochaine mise à jour ») ;
- volet sans calcul : le titre du tableau ne dit plus « stock domaine X »,
  puisque tout le stock de la boutique y est proposé.

Co-Authored-By: Claude Opus 5.5 <noreply@anthropic.com>
Claude-Session: https://claude.ai/code/session_01V9FfE1ccQN1sKVjUyrAC9z
</commit_message>
<xml_diff>
--- a/docs/manuel/chapitre-01-connexion-securite-et-navigation.docx
+++ b/docs/manuel/chapitre-01-connexion-securite-et-navigation.docx
@@ -322,7 +322,7 @@
                 <w:sz w:val="20"/>
                 <w:szCs w:val="20"/>
               </w:rPr>
-              <w:t xml:space="preserve">2.101.346</w:t>
+              <w:t xml:space="preserve">2.101.358</w:t>
             </w:r>
           </w:p>
         </w:tc>
@@ -368,7 +368,7 @@
                 <w:sz w:val="20"/>
                 <w:szCs w:val="20"/>
               </w:rPr>
-              <w:t xml:space="preserve">25 septembre 2026</w:t>
+              <w:t xml:space="preserve">27 septembre 2026</w:t>
             </w:r>
           </w:p>
         </w:tc>
@@ -8570,7 +8570,7 @@
         <w:sz w:val="14"/>
         <w:szCs w:val="14"/>
       </w:rPr>
-      <w:t xml:space="preserve">Version 2.101.346 de l'application  ·  25 septembre 2026  ·  document interne BMI Togo</w:t>
+      <w:t xml:space="preserve">Version 2.101.358 de l'application  ·  27 septembre 2026  ·  document interne BMI Togo</w:t>
     </w:r>
   </w:p>
 </w:ftr>

</xml_diff>

<commit_message>
2.101.376 — Manuel, chapitre 13 : Devis et proformas
Chapitre écrit d'après le code (Tous les devis, espace client, proformas
de Ventes, règles de modification, classement, relances, validation).
En l'écrivant :
- l'espace client annonçait, pour une pose seule, « le règlement se fait
  au technicien à la fin des travaux » : il dit désormais la règle des
  70 % avant la programmation ;
- le Devis PDF de Tous les devis et « Réimprimer » d'une proforma
  transmettent maintenant le prénom et l'entreprise cliente.
Deux contrôles de plus, éprouvés en remettant la faute.

Co-Authored-By: Claude Opus 5.5 <noreply@anthropic.com>
Claude-Session: https://claude.ai/code/session_01V9FfE1ccQN1sKVjUyrAC9z
</commit_message>
<xml_diff>
--- a/docs/manuel/chapitre-01-connexion-securite-et-navigation.docx
+++ b/docs/manuel/chapitre-01-connexion-securite-et-navigation.docx
@@ -322,7 +322,7 @@
                 <w:sz w:val="20"/>
                 <w:szCs w:val="20"/>
               </w:rPr>
-              <w:t xml:space="preserve">2.101.358</w:t>
+              <w:t xml:space="preserve">2.101.376</w:t>
             </w:r>
           </w:p>
         </w:tc>
@@ -368,7 +368,7 @@
                 <w:sz w:val="20"/>
                 <w:szCs w:val="20"/>
               </w:rPr>
-              <w:t xml:space="preserve">27 septembre 2026</w:t>
+              <w:t xml:space="preserve">29 septembre 2026</w:t>
             </w:r>
           </w:p>
         </w:tc>
@@ -8570,7 +8570,7 @@
         <w:sz w:val="14"/>
         <w:szCs w:val="14"/>
       </w:rPr>
-      <w:t xml:space="preserve">Version 2.101.358 de l'application  ·  27 septembre 2026  ·  document interne BMI Togo</w:t>
+      <w:t xml:space="preserve">Version 2.101.376 de l'application  ·  29 septembre 2026  ·  document interne BMI Togo</w:t>
     </w:r>
   </w:p>
 </w:ftr>

</xml_diff>

<commit_message>
2.101.377 — Manuel, chapitre 14 : Contrats (+ trois phrases fausses corrigées)
- Chapitre 14 du manuel (Contrats) : signature personnelle, signature du
  client depuis son espace, signature en boutique (écran / papier), plan de
  règlement du solde, liste 📄 Contrats, pose seule.
- 📄 Contrats : la pastille « En attente de paiement » d'une pose seule
  soldée restait allumée pour toujours ; elle suit maintenant la même règle
  que « Voir le contrat » (contratRegle).
- Contrat imprimé d'une pose seule : plus de « Paiement prévu à la
  boutique — ».
- Plan de règlement : les dates s'écrivent 31/10/2026, plus 2026-10-31.
- Bancs : verifier-cloisonnement 2009, tester-reglement 40 (un contrôle
  retourné, un ajouté), chacun éprouvé en remettant la faute.

Co-Authored-By: Claude Opus 5.5 <noreply@anthropic.com>
Claude-Session: https://claude.ai/code/session_01V9FfE1ccQN1sKVjUyrAC9z
</commit_message>
<xml_diff>
--- a/docs/manuel/chapitre-01-connexion-securite-et-navigation.docx
+++ b/docs/manuel/chapitre-01-connexion-securite-et-navigation.docx
@@ -322,7 +322,7 @@
                 <w:sz w:val="20"/>
                 <w:szCs w:val="20"/>
               </w:rPr>
-              <w:t xml:space="preserve">2.101.376</w:t>
+              <w:t xml:space="preserve">2.101.377</w:t>
             </w:r>
           </w:p>
         </w:tc>
@@ -368,7 +368,7 @@
                 <w:sz w:val="20"/>
                 <w:szCs w:val="20"/>
               </w:rPr>
-              <w:t xml:space="preserve">29 septembre 2026</w:t>
+              <w:t xml:space="preserve">30 septembre 2026</w:t>
             </w:r>
           </w:p>
         </w:tc>
@@ -8570,7 +8570,7 @@
         <w:sz w:val="14"/>
         <w:szCs w:val="14"/>
       </w:rPr>
-      <w:t xml:space="preserve">Version 2.101.376 de l'application  ·  29 septembre 2026  ·  document interne BMI Togo</w:t>
+      <w:t xml:space="preserve">Version 2.101.377 de l'application  ·  30 septembre 2026  ·  document interne BMI Togo</w:t>
     </w:r>
   </w:p>
 </w:ftr>

</xml_diff>

<commit_message>
2.101.378 — Manuel, chapitre 15 : Chantiers et travaux (+ trois phrases fausses, un trou du mur)
- Chapitre 15 du manuel : 🏠 Clients installés (fiche, programmation,
  dossier, fin des travaux et PV, réserves et avenant, frais
  d'installation, entretien) et 🛠 Travaux à crédit.
- Clients installés : la liste « Vente rattachée » ne propose plus que
  les ventes de l'espace regardé (elle lisait toutes les ventes).
- Un technicien BMI de l'équipe voit le chantier où il intervient.
- Deux phrases fausses corrigées : la légende (« les techniciens voient
  tout le parc ») et la fiche sans compte (« ne pourra pas réceptionner »).
- Règle du projet : le manuel suit l'application (chapitres concernés
  relus et dits à chaque envoi).
- Banc : verifier-cloisonnement 2012, chaque contrôle éprouvé.

Co-Authored-By: Claude Opus 5.5 <noreply@anthropic.com>
Claude-Session: https://claude.ai/code/session_01V9FfE1ccQN1sKVjUyrAC9z
</commit_message>
<xml_diff>
--- a/docs/manuel/chapitre-01-connexion-securite-et-navigation.docx
+++ b/docs/manuel/chapitre-01-connexion-securite-et-navigation.docx
@@ -322,7 +322,7 @@
                 <w:sz w:val="20"/>
                 <w:szCs w:val="20"/>
               </w:rPr>
-              <w:t xml:space="preserve">2.101.377</w:t>
+              <w:t xml:space="preserve">2.101.378</w:t>
             </w:r>
           </w:p>
         </w:tc>
@@ -8570,7 +8570,7 @@
         <w:sz w:val="14"/>
         <w:szCs w:val="14"/>
       </w:rPr>
-      <w:t xml:space="preserve">Version 2.101.377 de l'application  ·  30 septembre 2026  ·  document interne BMI Togo</w:t>
+      <w:t xml:space="preserve">Version 2.101.378 de l'application  ·  30 septembre 2026  ·  document interne BMI Togo</w:t>
     </w:r>
   </w:p>
 </w:ftr>

</xml_diff>

<commit_message>
WhatsApp : le refus d'un numéro chinois (+86) se dit en français ; chapitre 7 à jour (2.101.379)
Meta refuse tout message vers la Chine continentale ; la phrase anglaise
restait telle quelle. Règle à mots vue pour de vrai le 30/09/2026, contrôle
éprouvé en retirant la règle. Le chapitre 7 citait encore « WhatsApp s'est
ouvert… », remplacé le 29/09 par « Appuyez sur OK : WhatsApp s'ouvre… ».

Co-Authored-By: Claude Opus 5.5 <noreply@anthropic.com>
Claude-Session: https://claude.ai/code/session_01V9FfE1ccQN1sKVjUyrAC9z
</commit_message>
<xml_diff>
--- a/docs/manuel/chapitre-01-connexion-securite-et-navigation.docx
+++ b/docs/manuel/chapitre-01-connexion-securite-et-navigation.docx
@@ -322,7 +322,7 @@
                 <w:sz w:val="20"/>
                 <w:szCs w:val="20"/>
               </w:rPr>
-              <w:t xml:space="preserve">2.101.378</w:t>
+              <w:t xml:space="preserve">2.101.379</w:t>
             </w:r>
           </w:p>
         </w:tc>
@@ -8570,7 +8570,7 @@
         <w:sz w:val="14"/>
         <w:szCs w:val="14"/>
       </w:rPr>
-      <w:t xml:space="preserve">Version 2.101.378 de l'application  ·  30 septembre 2026  ·  document interne BMI Togo</w:t>
+      <w:t xml:space="preserve">Version 2.101.379 de l'application  ·  30 septembre 2026  ·  document interne BMI Togo</w:t>
     </w:r>
   </w:p>
 </w:ftr>

</xml_diff>

<commit_message>
Manuel : chapitre 16 (Commissions et primes) ; quatre phrases fausses et le mur de Ma commission corrigés (2.101.380)
- Ma commission : les ventes de l'espace regardé (un commercial de formation
  n'en voyait aucune) ; « en attente de réception » séparé de « en attente du
  paiement du client ».
- Espace client : la part du parrain attend la réception ET le paiement.
- Message au parrain : « maintenant due » seulement si la dette est soldée.
- 🎯 Commerciaux : « Commissions estimées (CA × taux) ».
Chaque contrôle éprouvé en remettant la faute. Chapitre 5 aligné.

Co-Authored-By: Claude Opus 5.5 <noreply@anthropic.com>
Claude-Session: https://claude.ai/code/session_01V9FfE1ccQN1sKVjUyrAC9z
</commit_message>
<xml_diff>
--- a/docs/manuel/chapitre-01-connexion-securite-et-navigation.docx
+++ b/docs/manuel/chapitre-01-connexion-securite-et-navigation.docx
@@ -322,7 +322,7 @@
                 <w:sz w:val="20"/>
                 <w:szCs w:val="20"/>
               </w:rPr>
-              <w:t xml:space="preserve">2.101.379</w:t>
+              <w:t xml:space="preserve">2.101.380</w:t>
             </w:r>
           </w:p>
         </w:tc>
@@ -8570,7 +8570,7 @@
         <w:sz w:val="14"/>
         <w:szCs w:val="14"/>
       </w:rPr>
-      <w:t xml:space="preserve">Version 2.101.379 de l'application  ·  30 septembre 2026  ·  document interne BMI Togo</w:t>
+      <w:t xml:space="preserve">Version 2.101.380 de l'application  ·  30 septembre 2026  ·  document interne BMI Togo</w:t>
     </w:r>
   </w:p>
 </w:ftr>

</xml_diff>

<commit_message>
Assistant WhatsApp : ne jamais dire ce que BMI ne fait pas (forage)
La consigne l'interdit et reçoit les métiers réglés sur les boutiques
réelles ; le juge jette une réponse qui nie un métier et un conseiller
prend le relais. Banc ㊳ (8 contrôles), éprouvé.

Co-Authored-By: Claude Opus 5.5 <noreply@anthropic.com>
Claude-Session: https://claude.ai/code/session_01V9FfE1ccQN1sKVjUyrAC9z
</commit_message>
<xml_diff>
--- a/docs/manuel/chapitre-01-connexion-securite-et-navigation.docx
+++ b/docs/manuel/chapitre-01-connexion-securite-et-navigation.docx
@@ -322,7 +322,7 @@
                 <w:sz w:val="20"/>
                 <w:szCs w:val="20"/>
               </w:rPr>
-              <w:t xml:space="preserve">2.101.380</w:t>
+              <w:t xml:space="preserve">2.101.381</w:t>
             </w:r>
           </w:p>
         </w:tc>
@@ -8570,7 +8570,7 @@
         <w:sz w:val="14"/>
         <w:szCs w:val="14"/>
       </w:rPr>
-      <w:t xml:space="preserve">Version 2.101.380 de l'application  ·  30 septembre 2026  ·  document interne BMI Togo</w:t>
+      <w:t xml:space="preserve">Version 2.101.381 de l'application  ·  30 septembre 2026  ·  document interne BMI Togo</w:t>
     </w:r>
   </w:p>
 </w:ftr>

</xml_diff>

<commit_message>
Proforma : envoi du numéro WhatsApp BMI (modèle proforma)
Huit trous remplis depuis la proforma, liste des articles sur une ligne,
fin de l'offre à 15 jours ; question avant l'envoi, repli sur l'ouverture
WhatsApp d'avant. Chapitres 5 et 13 du manuel à jour. Banc ㊴ (8).

Co-Authored-By: Claude Opus 5.5 <noreply@anthropic.com>
Claude-Session: https://claude.ai/code/session_01V9FfE1ccQN1sKVjUyrAC9z
</commit_message>
<xml_diff>
--- a/docs/manuel/chapitre-01-connexion-securite-et-navigation.docx
+++ b/docs/manuel/chapitre-01-connexion-securite-et-navigation.docx
@@ -322,7 +322,7 @@
                 <w:sz w:val="20"/>
                 <w:szCs w:val="20"/>
               </w:rPr>
-              <w:t xml:space="preserve">2.101.381</w:t>
+              <w:t xml:space="preserve">2.101.382</w:t>
             </w:r>
           </w:p>
         </w:tc>
@@ -8570,7 +8570,7 @@
         <w:sz w:val="14"/>
         <w:szCs w:val="14"/>
       </w:rPr>
-      <w:t xml:space="preserve">Version 2.101.381 de l'application  ·  30 septembre 2026  ·  document interne BMI Togo</w:t>
+      <w:t xml:space="preserve">Version 2.101.382 de l'application  ·  30 septembre 2026  ·  document interne BMI Togo</w:t>
     </w:r>
   </w:p>
 </w:ftr>

</xml_diff>

<commit_message>
Clients sans suite : archivés 30 jours après leur dernier devis, effacement proposé un an plus tard (2.101.383)
Co-Authored-By: Claude Opus 5.5 <noreply@anthropic.com>
Claude-Session: https://claude.ai/code/session_01V9FfE1ccQN1sKVjUyrAC9z
</commit_message>
<xml_diff>
--- a/docs/manuel/chapitre-01-connexion-securite-et-navigation.docx
+++ b/docs/manuel/chapitre-01-connexion-securite-et-navigation.docx
@@ -322,7 +322,7 @@
                 <w:sz w:val="20"/>
                 <w:szCs w:val="20"/>
               </w:rPr>
-              <w:t xml:space="preserve">2.101.382</w:t>
+              <w:t xml:space="preserve">2.101.383</w:t>
             </w:r>
           </w:p>
         </w:tc>
@@ -8570,7 +8570,7 @@
         <w:sz w:val="14"/>
         <w:szCs w:val="14"/>
       </w:rPr>
-      <w:t xml:space="preserve">Version 2.101.382 de l'application  ·  30 septembre 2026  ·  document interne BMI Togo</w:t>
+      <w:t xml:space="preserve">Version 2.101.383 de l'application  ·  30 septembre 2026  ·  document interne BMI Togo</w:t>
     </w:r>
   </w:p>
 </w:ftr>

</xml_diff>

<commit_message>
Un seul taux de commission : 🎯 Commerciaux affiche celui de la fiche d'employé (2.101.384)
Co-Authored-By: Claude Opus 5.5 <noreply@anthropic.com>
Claude-Session: https://claude.ai/code/session_01V9FfE1ccQN1sKVjUyrAC9z
</commit_message>
<xml_diff>
--- a/docs/manuel/chapitre-01-connexion-securite-et-navigation.docx
+++ b/docs/manuel/chapitre-01-connexion-securite-et-navigation.docx
@@ -322,7 +322,7 @@
                 <w:sz w:val="20"/>
                 <w:szCs w:val="20"/>
               </w:rPr>
-              <w:t xml:space="preserve">2.101.383</w:t>
+              <w:t xml:space="preserve">2.101.384</w:t>
             </w:r>
           </w:p>
         </w:tc>
@@ -8570,7 +8570,7 @@
         <w:sz w:val="14"/>
         <w:szCs w:val="14"/>
       </w:rPr>
-      <w:t xml:space="preserve">Version 2.101.383 de l'application  ·  30 septembre 2026  ·  document interne BMI Togo</w:t>
+      <w:t xml:space="preserve">Version 2.101.384 de l'application  ·  30 septembre 2026  ·  document interne BMI Togo</w:t>
     </w:r>
   </w:p>
 </w:ftr>

</xml_diff>

<commit_message>
La remise d'une proforma suit sa vente si le panier n'a pas bougé (2.101.385)
Co-Authored-By: Claude Opus 5.5 <noreply@anthropic.com>
Claude-Session: https://claude.ai/code/session_01V9FfE1ccQN1sKVjUyrAC9z
</commit_message>
<xml_diff>
--- a/docs/manuel/chapitre-01-connexion-securite-et-navigation.docx
+++ b/docs/manuel/chapitre-01-connexion-securite-et-navigation.docx
@@ -322,7 +322,7 @@
                 <w:sz w:val="20"/>
                 <w:szCs w:val="20"/>
               </w:rPr>
-              <w:t xml:space="preserve">2.101.384</w:t>
+              <w:t xml:space="preserve">2.101.385</w:t>
             </w:r>
           </w:p>
         </w:tc>
@@ -8570,7 +8570,7 @@
         <w:sz w:val="14"/>
         <w:szCs w:val="14"/>
       </w:rPr>
-      <w:t xml:space="preserve">Version 2.101.384 de l'application  ·  30 septembre 2026  ·  document interne BMI Togo</w:t>
+      <w:t xml:space="preserve">Version 2.101.385 de l'application  ·  30 septembre 2026  ·  document interne BMI Togo</w:t>
     </w:r>
   </w:p>
 </w:ftr>

</xml_diff>

<commit_message>
Une proforma se modifie : même numéro, trace, auteur et administrateur (2.101.386)
Co-Authored-By: Claude Opus 5.5 <noreply@anthropic.com>
Claude-Session: https://claude.ai/code/session_01V9FfE1ccQN1sKVjUyrAC9z
</commit_message>
<xml_diff>
--- a/docs/manuel/chapitre-01-connexion-securite-et-navigation.docx
+++ b/docs/manuel/chapitre-01-connexion-securite-et-navigation.docx
@@ -322,7 +322,7 @@
                 <w:sz w:val="20"/>
                 <w:szCs w:val="20"/>
               </w:rPr>
-              <w:t xml:space="preserve">2.101.385</w:t>
+              <w:t xml:space="preserve">2.101.386</w:t>
             </w:r>
           </w:p>
         </w:tc>
@@ -8570,7 +8570,7 @@
         <w:sz w:val="14"/>
         <w:szCs w:val="14"/>
       </w:rPr>
-      <w:t xml:space="preserve">Version 2.101.385 de l'application  ·  30 septembre 2026  ·  document interne BMI Togo</w:t>
+      <w:t xml:space="preserve">Version 2.101.386 de l'application  ·  30 septembre 2026  ·  document interne BMI Togo</w:t>
     </w:r>
   </w:p>
 </w:ftr>

</xml_diff>

<commit_message>
Manuel : chapitre 17 (Dépenses) ; le refus du tiroir ne promet plus un remboursement automatique de l'avance
Le chapitre 17 est écrit d'après Depenses.jsx, validationDepenses.js,
versements.js, depensesChantier.js, loyer.js et les avances de Caisse.jsx.
En le relisant : le refus d'une dépense plus grosse que le tiroir disait
que l'avance « sera remboursée dès que la caisse le permettra ». Le
remboursement est un geste (🔒 Caisse → Avances de frais à rembourser) ;
la phrase le dit maintenant, contrôle éprouvé. Version 2.101.387.

Co-Authored-By: Claude Opus 5.5 <noreply@anthropic.com>
Claude-Session: https://claude.ai/code/session_01V9FfE1ccQN1sKVjUyrAC9z
</commit_message>
<xml_diff>
--- a/docs/manuel/chapitre-01-connexion-securite-et-navigation.docx
+++ b/docs/manuel/chapitre-01-connexion-securite-et-navigation.docx
@@ -322,7 +322,7 @@
                 <w:sz w:val="20"/>
                 <w:szCs w:val="20"/>
               </w:rPr>
-              <w:t xml:space="preserve">2.101.386</w:t>
+              <w:t xml:space="preserve">2.101.387</w:t>
             </w:r>
           </w:p>
         </w:tc>
@@ -8570,7 +8570,7 @@
         <w:sz w:val="14"/>
         <w:szCs w:val="14"/>
       </w:rPr>
-      <w:t xml:space="preserve">Version 2.101.386 de l'application  ·  30 septembre 2026  ·  document interne BMI Togo</w:t>
+      <w:t xml:space="preserve">Version 2.101.387 de l'application  ·  30 septembre 2026  ·  document interne BMI Togo</w:t>
     </w:r>
   </w:p>
 </w:ftr>

</xml_diff>

<commit_message>
Dépenses : plus jamais « Crédit (dette) » ; manuel : chapitre 18 (Salaires) ; deux phrases de la paie corrigées
- 📤 Dépenses ne propose plus « Crédit (dette) », et la fabrique de la
  dépense le refuse dans le geste (contrôle éprouvé).
- 💵 Salaires écrivait « Vendeur » pour un comptable ou un responsable
  commercial : le libellé vient de la liste commune des rôles.
- La fenêtre du virement de salaire détaille la retenue CNSS : ses lignes
  aboutissent au net annoncé.
- Chapitre 18 (Salaires) écrit ; chapitre 2 : les onglets du vendeur et du
  gérant réécrits d'après les menus ; chapitre 17 mis à jour.
Version 2.101.388.

Co-Authored-By: Claude Opus 5.5 <noreply@anthropic.com>
Claude-Session: https://claude.ai/code/session_01V9FfE1ccQN1sKVjUyrAC9z
</commit_message>
<xml_diff>
--- a/docs/manuel/chapitre-01-connexion-securite-et-navigation.docx
+++ b/docs/manuel/chapitre-01-connexion-securite-et-navigation.docx
@@ -322,7 +322,7 @@
                 <w:sz w:val="20"/>
                 <w:szCs w:val="20"/>
               </w:rPr>
-              <w:t xml:space="preserve">2.101.387</w:t>
+              <w:t xml:space="preserve">2.101.388</w:t>
             </w:r>
           </w:p>
         </w:tc>
@@ -8570,7 +8570,7 @@
         <w:sz w:val="14"/>
         <w:szCs w:val="14"/>
       </w:rPr>
-      <w:t xml:space="preserve">Version 2.101.387 de l'application  ·  30 septembre 2026  ·  document interne BMI Togo</w:t>
+      <w:t xml:space="preserve">Version 2.101.388 de l'application  ·  30 septembre 2026  ·  document interne BMI Togo</w:t>
     </w:r>
   </w:p>
 </w:ftr>

</xml_diff>

<commit_message>
2.101.389 — le PV, l'avenant, l'accueil et la relance d'un prospect partent du numéro WhatsApp BMI ; la fiche d'un prospect porte son projet
Quatre modèles créés par Timo chez YCloud (lien_signature_pv, avenant_reserves,
accueil_prospect, relance_prospect), textes mot pour mot en repli. Décision « a » :
une liste « Projet » sur la fiche, nommée dans la relance (« NON pour l'accueil »).
La « Nature du chantier » ne part jamais au client. Banc ㉚ (13 contrôles),
manuel : chapitres 4 et 15 mis à jour.

Co-Authored-By: Claude Opus 5.5 <noreply@anthropic.com>
Claude-Session: https://claude.ai/code/session_01V9FfE1ccQN1sKVjUyrAC9z
</commit_message>
<xml_diff>
--- a/docs/manuel/chapitre-01-connexion-securite-et-navigation.docx
+++ b/docs/manuel/chapitre-01-connexion-securite-et-navigation.docx
@@ -322,7 +322,7 @@
                 <w:sz w:val="20"/>
                 <w:szCs w:val="20"/>
               </w:rPr>
-              <w:t xml:space="preserve">2.101.388</w:t>
+              <w:t xml:space="preserve">2.101.389</w:t>
             </w:r>
           </w:p>
         </w:tc>
@@ -8570,7 +8570,7 @@
         <w:sz w:val="14"/>
         <w:szCs w:val="14"/>
       </w:rPr>
-      <w:t xml:space="preserve">Version 2.101.388 de l'application  ·  30 septembre 2026  ·  document interne BMI Togo</w:t>
+      <w:t xml:space="preserve">Version 2.101.389 de l'application  ·  30 septembre 2026  ·  document interne BMI Togo</w:t>
     </w:r>
   </w:p>
 </w:ftr>

</xml_diff>

<commit_message>
2.101.390 — 🔒 Mes données : la demande du client arrive sur le numéro WhatsApp BMI, plus sur le téléphone d'une boutique
Le client écrit toujours de son téléphone ; sa demande entre maintenant dans
📲 WhatsApp de l'application. Un compte de formation est renvoyé vers 💬 Messages.
Deux contrôles RETOURNÉS (verifier-cloisonnement), un dans verifier-whatsapp.
Manuel : chapitre 3 mis à jour.

Co-Authored-By: Claude Opus 5.5 <noreply@anthropic.com>
Claude-Session: https://claude.ai/code/session_01V9FfE1ccQN1sKVjUyrAC9z
</commit_message>
<xml_diff>
--- a/docs/manuel/chapitre-01-connexion-securite-et-navigation.docx
+++ b/docs/manuel/chapitre-01-connexion-securite-et-navigation.docx
@@ -322,7 +322,7 @@
                 <w:sz w:val="20"/>
                 <w:szCs w:val="20"/>
               </w:rPr>
-              <w:t xml:space="preserve">2.101.389</w:t>
+              <w:t xml:space="preserve">2.101.390</w:t>
             </w:r>
           </w:p>
         </w:tc>
@@ -8570,7 +8570,7 @@
         <w:sz w:val="14"/>
         <w:szCs w:val="14"/>
       </w:rPr>
-      <w:t xml:space="preserve">Version 2.101.389 de l'application  ·  30 septembre 2026  ·  document interne BMI Togo</w:t>
+      <w:t xml:space="preserve">Version 2.101.390 de l'application  ·  30 septembre 2026  ·  document interne BMI Togo</w:t>
     </w:r>
   </w:p>
 </w:ftr>

</xml_diff>

<commit_message>
2.101.391 — manuel : chapitre 19 (Outillage) ; deux phrases fausses de 🧰 Outillage corrigées
« Déclarer perdu » d'un outil rangé écrivait un trou ${…} en toutes lettres :
contrôle général ajouté (aucune chaîne entre guillemets droits ne porte « ${ »,
src et api, lu dans l'arbre des fichiers). « Corriger la fiche » conseillait un
retour impossible pour changer le lieu. Date du manuel : 1er octobre 2026.

Co-Authored-By: Claude Opus 5.5 <noreply@anthropic.com>
Claude-Session: https://claude.ai/code/session_01V9FfE1ccQN1sKVjUyrAC9z
</commit_message>
<xml_diff>
--- a/docs/manuel/chapitre-01-connexion-securite-et-navigation.docx
+++ b/docs/manuel/chapitre-01-connexion-securite-et-navigation.docx
@@ -322,7 +322,7 @@
                 <w:sz w:val="20"/>
                 <w:szCs w:val="20"/>
               </w:rPr>
-              <w:t xml:space="preserve">2.101.390</w:t>
+              <w:t xml:space="preserve">2.101.391</w:t>
             </w:r>
           </w:p>
         </w:tc>
@@ -368,7 +368,7 @@
                 <w:sz w:val="20"/>
                 <w:szCs w:val="20"/>
               </w:rPr>
-              <w:t xml:space="preserve">30 septembre 2026</w:t>
+              <w:t xml:space="preserve">1er octobre 2026</w:t>
             </w:r>
           </w:p>
         </w:tc>
@@ -8570,7 +8570,7 @@
         <w:sz w:val="14"/>
         <w:szCs w:val="14"/>
       </w:rPr>
-      <w:t xml:space="preserve">Version 2.101.390 de l'application  ·  30 septembre 2026  ·  document interne BMI Togo</w:t>
+      <w:t xml:space="preserve">Version 2.101.391 de l'application  ·  1er octobre 2026  ·  document interne BMI Togo</w:t>
     </w:r>
   </w:p>
 </w:ftr>

</xml_diff>

<commit_message>
2.101.392 — manuel : chapitre 20 (Messagerie et WhatsApp) ; « 🔁 Confier » ne propose plus le comptable
Confiée au comptable (qui n'a pas 📲 WhatsApp), une conversation n'était plus
lisible que par l'administrateur : la liste passe par aAccesWhatsapp. Deux
phrases d'écran rendues exactes. Banc ㊶ (3 contrôles), éprouvé.

Co-Authored-By: Claude Opus 5.5 <noreply@anthropic.com>
Claude-Session: https://claude.ai/code/session_01V9FfE1ccQN1sKVjUyrAC9z
</commit_message>
<xml_diff>
--- a/docs/manuel/chapitre-01-connexion-securite-et-navigation.docx
+++ b/docs/manuel/chapitre-01-connexion-securite-et-navigation.docx
@@ -322,7 +322,7 @@
                 <w:sz w:val="20"/>
                 <w:szCs w:val="20"/>
               </w:rPr>
-              <w:t xml:space="preserve">2.101.391</w:t>
+              <w:t xml:space="preserve">2.101.392</w:t>
             </w:r>
           </w:p>
         </w:tc>
@@ -8570,7 +8570,7 @@
         <w:sz w:val="14"/>
         <w:szCs w:val="14"/>
       </w:rPr>
-      <w:t xml:space="preserve">Version 2.101.391 de l'application  ·  1er octobre 2026  ·  document interne BMI Togo</w:t>
+      <w:t xml:space="preserve">Version 2.101.392 de l'application  ·  1er octobre 2026  ·  document interne BMI Togo</w:t>
     </w:r>
   </w:p>
 </w:ftr>

</xml_diff>

<commit_message>
2.101.393 — manuel : chapitre 21 (Espace client) ; un montant n'écrit plus son « F » deux fois
fmt colle déjà « F » : 31 endroits ajoutaient une unité (« 120 000 F F » dans
l'espace client, « 1 200 000 F FCFA » dans les contrats et le PV, écran et
impression). fmtFcfa (core.js) pour les documents en FCFA, et un contrôle général
(src et api) qui refuse tout fmt(…) suivi d'une unité tapée — éprouvé.

Co-Authored-By: Claude Opus 5.5 <noreply@anthropic.com>
Claude-Session: https://claude.ai/code/session_01V9FfE1ccQN1sKVjUyrAC9z
</commit_message>
<xml_diff>
--- a/docs/manuel/chapitre-01-connexion-securite-et-navigation.docx
+++ b/docs/manuel/chapitre-01-connexion-securite-et-navigation.docx
@@ -322,7 +322,7 @@
                 <w:sz w:val="20"/>
                 <w:szCs w:val="20"/>
               </w:rPr>
-              <w:t xml:space="preserve">2.101.392</w:t>
+              <w:t xml:space="preserve">2.101.393</w:t>
             </w:r>
           </w:p>
         </w:tc>
@@ -8570,7 +8570,7 @@
         <w:sz w:val="14"/>
         <w:szCs w:val="14"/>
       </w:rPr>
-      <w:t xml:space="preserve">Version 2.101.392 de l'application  ·  1er octobre 2026  ·  document interne BMI Togo</w:t>
+      <w:t xml:space="preserve">Version 2.101.393 de l'application  ·  1er octobre 2026  ·  document interne BMI Togo</w:t>
     </w:r>
   </w:p>
 </w:ftr>

</xml_diff>

<commit_message>
2.101.394 — manuel : chapitre 22 (Rentabilité, tableau de bord, historique) ; l'historique et le journal comptable suivent l'espace regardé
- 🕘 Historique : le journal suit l'espace REGARDÉ (le principal y lisait les gestes d'entraînement mêlés aux vrais).
- 📒 Journal comptable : le principal qui regardait la formation exportait les vraies écritures ; lignesJournal reçoit le filtre d'espace de l'écran.
- Bandeaux de formation de 📊 et 📈 : « vous regardez », plus « votre compte travaille », pour le principal.
- 📈 Rentabilité dit ce qu'elle compte (prix vendu, prix d'achat actuel de la fiche).
- 🏆 Top 5 : remise générale et reprises déduites (caLigneVente), le même chiffre que Rentabilité.
- Un relevé de caisse coupé à 100 mouvements le dit.
- Banc : les trois écrans rendus (scripts/_rendu-rapports.jsx), éprouvé en remettant les fautes ; un contrôle retourné.

Co-Authored-By: Claude Opus 5.5 <noreply@anthropic.com>
Claude-Session: https://claude.ai/code/session_01V9FfE1ccQN1sKVjUyrAC9z
</commit_message>
<xml_diff>
--- a/docs/manuel/chapitre-01-connexion-securite-et-navigation.docx
+++ b/docs/manuel/chapitre-01-connexion-securite-et-navigation.docx
@@ -322,7 +322,7 @@
                 <w:sz w:val="20"/>
                 <w:szCs w:val="20"/>
               </w:rPr>
-              <w:t xml:space="preserve">2.101.393</w:t>
+              <w:t xml:space="preserve">2.101.394</w:t>
             </w:r>
           </w:p>
         </w:tc>
@@ -8570,7 +8570,7 @@
         <w:sz w:val="14"/>
         <w:szCs w:val="14"/>
       </w:rPr>
-      <w:t xml:space="preserve">Version 2.101.393 de l'application  ·  1er octobre 2026  ·  document interne BMI Togo</w:t>
+      <w:t xml:space="preserve">Version 2.101.394 de l'application  ·  1er octobre 2026  ·  document interne BMI Togo</w:t>
     </w:r>
   </w:p>
 </w:ftr>

</xml_diff>

<commit_message>
2.101.395 — manuel : chapitre 23 (Paramètres) ; six phrases de ⚙ Paramètres disent enfin vrai
- Parrainage : dû à la réception ET au solde (plus « versé à la réception »).
- Une boutique de formation n'est pas « hors Tableau de bord ».
- 🔐 Sécurité Supabase : la session sécurisée est en place ; plus d'appel à exécuter durcir_securite.sql.
- 👑 Administrateur principal : ses vrais gestes réservés ; plus de « uniquement depuis le logiciel Windows » (écran et confirmation du transfert).
- Le journal d'une réinitialisation dit d'où elle a été faite.
- « Réinitialiser uniquement la formation » dit tout ce qu'elle efface.
- L'assistant : faits de BMI jamais inventés, conseil général permis.
- L'onglet 🎨 Apparence n'existe que pour le principal (il était vide pour les autres).
- Banc : 8 contrôles, éprouvés sur l'ancien fichier.

Co-Authored-By: Claude Opus 5.5 <noreply@anthropic.com>
Claude-Session: https://claude.ai/code/session_01V9FfE1ccQN1sKVjUyrAC9z
</commit_message>
<xml_diff>
--- a/docs/manuel/chapitre-01-connexion-securite-et-navigation.docx
+++ b/docs/manuel/chapitre-01-connexion-securite-et-navigation.docx
@@ -322,7 +322,7 @@
                 <w:sz w:val="20"/>
                 <w:szCs w:val="20"/>
               </w:rPr>
-              <w:t xml:space="preserve">2.101.394</w:t>
+              <w:t xml:space="preserve">2.101.395</w:t>
             </w:r>
           </w:p>
         </w:tc>
@@ -8570,7 +8570,7 @@
         <w:sz w:val="14"/>
         <w:szCs w:val="14"/>
       </w:rPr>
-      <w:t xml:space="preserve">Version 2.101.394 de l'application  ·  1er octobre 2026  ·  document interne BMI Togo</w:t>
+      <w:t xml:space="preserve">Version 2.101.395 de l'application  ·  1er octobre 2026  ·  document interne BMI Togo</w:t>
     </w:r>
   </w:p>
 </w:ftr>

</xml_diff>

<commit_message>
2.101.396 — manuel : chapitre 24 (Hors connexion) ; un envoi bloqué ne dit plus « déconnectez-vous puis reconnectez-vous »
- Bande rouge : un REFUS du serveur (prévenir le principal, 🗑 Abandonner) se distingue d'un simple réessai (20 secondes, rien n'est perdu).
- Session expirée : « Rétablir » puis le mot de passe (sync.js, supabaseClient.js).
- Une panne de réseau ne s'affiche plus en anglais ; le détail part dans la console.
- Banc : 5 contrôles, éprouvés sur les anciens fichiers.

Co-Authored-By: Claude Opus 5.5 <noreply@anthropic.com>
Claude-Session: https://claude.ai/code/session_01V9FfE1ccQN1sKVjUyrAC9z
</commit_message>
<xml_diff>
--- a/docs/manuel/chapitre-01-connexion-securite-et-navigation.docx
+++ b/docs/manuel/chapitre-01-connexion-securite-et-navigation.docx
@@ -322,7 +322,7 @@
                 <w:sz w:val="20"/>
                 <w:szCs w:val="20"/>
               </w:rPr>
-              <w:t xml:space="preserve">2.101.395</w:t>
+              <w:t xml:space="preserve">2.101.396</w:t>
             </w:r>
           </w:p>
         </w:tc>
@@ -8570,7 +8570,7 @@
         <w:sz w:val="14"/>
         <w:szCs w:val="14"/>
       </w:rPr>
-      <w:t xml:space="preserve">Version 2.101.395 de l'application  ·  1er octobre 2026  ·  document interne BMI Togo</w:t>
+      <w:t xml:space="preserve">Version 2.101.396 de l'application  ·  1er octobre 2026  ·  document interne BMI Togo</w:t>
     </w:r>
   </w:p>
 </w:ftr>

</xml_diff>

<commit_message>
2.101.397 — manuel : chapitre 25 (Incidents), le manuel est complet ; la bande « notifications bloquées » dit de recharger la page, plus de se reconnecter
Co-Authored-By: Claude Opus 5.5 <noreply@anthropic.com>
Claude-Session: https://claude.ai/code/session_01V9FfE1ccQN1sKVjUyrAC9z
</commit_message>
<xml_diff>
--- a/docs/manuel/chapitre-01-connexion-securite-et-navigation.docx
+++ b/docs/manuel/chapitre-01-connexion-securite-et-navigation.docx
@@ -322,7 +322,7 @@
                 <w:sz w:val="20"/>
                 <w:szCs w:val="20"/>
               </w:rPr>
-              <w:t xml:space="preserve">2.101.396</w:t>
+              <w:t xml:space="preserve">2.101.397</w:t>
             </w:r>
           </w:p>
         </w:tc>
@@ -8570,7 +8570,7 @@
         <w:sz w:val="14"/>
         <w:szCs w:val="14"/>
       </w:rPr>
-      <w:t xml:space="preserve">Version 2.101.396 de l'application  ·  1er octobre 2026  ·  document interne BMI Togo</w:t>
+      <w:t xml:space="preserve">Version 2.101.397 de l'application  ·  1er octobre 2026  ·  document interne BMI Togo</w:t>
     </w:r>
   </w:p>
 </w:ftr>

</xml_diff>

<commit_message>
2.101.398 — guides par poste : le guide du vendeur (ma journée, ses chapitres, l'examen pratique), et un contrôle qui le compare aux vrais onglets du poste
Co-Authored-By: Claude Opus 5.5 <noreply@anthropic.com>
Claude-Session: https://claude.ai/code/session_01V9FfE1ccQN1sKVjUyrAC9z
</commit_message>
<xml_diff>
--- a/docs/manuel/chapitre-01-connexion-securite-et-navigation.docx
+++ b/docs/manuel/chapitre-01-connexion-securite-et-navigation.docx
@@ -322,7 +322,7 @@
                 <w:sz w:val="20"/>
                 <w:szCs w:val="20"/>
               </w:rPr>
-              <w:t xml:space="preserve">2.101.397</w:t>
+              <w:t xml:space="preserve">2.101.398</w:t>
             </w:r>
           </w:p>
         </w:tc>
@@ -8570,7 +8570,7 @@
         <w:sz w:val="14"/>
         <w:szCs w:val="14"/>
       </w:rPr>
-      <w:t xml:space="preserve">Version 2.101.397 de l'application  ·  1er octobre 2026  ·  document interne BMI Togo</w:t>
+      <w:t xml:space="preserve">Version 2.101.398 de l'application  ·  1er octobre 2026  ·  document interne BMI Togo</w:t>
     </w:r>
   </w:p>
 </w:ftr>

</xml_diff>

<commit_message>
2.101.399 — guides par poste : le guide du gérant (ma journée relue dans le code, ses 18 chapitres, l'examen pratique)
Co-Authored-By: Claude Opus 5.5 <noreply@anthropic.com>
Claude-Session: https://claude.ai/code/session_01V9FfE1ccQN1sKVjUyrAC9z
</commit_message>
<xml_diff>
--- a/docs/manuel/chapitre-01-connexion-securite-et-navigation.docx
+++ b/docs/manuel/chapitre-01-connexion-securite-et-navigation.docx
@@ -322,7 +322,7 @@
                 <w:sz w:val="20"/>
                 <w:szCs w:val="20"/>
               </w:rPr>
-              <w:t xml:space="preserve">2.101.398</w:t>
+              <w:t xml:space="preserve">2.101.399</w:t>
             </w:r>
           </w:p>
         </w:tc>
@@ -8570,7 +8570,7 @@
         <w:sz w:val="14"/>
         <w:szCs w:val="14"/>
       </w:rPr>
-      <w:t xml:space="preserve">Version 2.101.398 de l'application  ·  1er octobre 2026  ·  document interne BMI Togo</w:t>
+      <w:t xml:space="preserve">Version 2.101.399 de l'application  ·  1er octobre 2026  ·  document interne BMI Togo</w:t>
     </w:r>
   </w:p>
 </w:ftr>

</xml_diff>

<commit_message>
Guide du poste : le magasinier (2.101.400)
Partie 1 « Ma journée » relue dans le code (transfert reçu validé dans
📦 Stocks, sortie d'outils par lot, appel par lieu), Partie 2 les onze
chapitres de ses onglets, Partie 3 l'examen pratique (11 épreuves,
5 questions, fiche à signer).

Co-Authored-By: Claude Opus 5.5 <noreply@anthropic.com>
Claude-Session: https://claude.ai/code/session_01V9FfE1ccQN1sKVjUyrAC9z
</commit_message>
<xml_diff>
--- a/docs/manuel/chapitre-01-connexion-securite-et-navigation.docx
+++ b/docs/manuel/chapitre-01-connexion-securite-et-navigation.docx
@@ -322,7 +322,7 @@
                 <w:sz w:val="20"/>
                 <w:szCs w:val="20"/>
               </w:rPr>
-              <w:t xml:space="preserve">2.101.399</w:t>
+              <w:t xml:space="preserve">2.101.400</w:t>
             </w:r>
           </w:p>
         </w:tc>
@@ -8570,7 +8570,7 @@
         <w:sz w:val="14"/>
         <w:szCs w:val="14"/>
       </w:rPr>
-      <w:t xml:space="preserve">Version 2.101.399 de l'application  ·  1er octobre 2026  ·  document interne BMI Togo</w:t>
+      <w:t xml:space="preserve">Version 2.101.400 de l'application  ·  1er octobre 2026  ·  document interne BMI Togo</w:t>
     </w:r>
   </w:p>
 </w:ftr>

</xml_diff>

<commit_message>
Guide du poste : commercial et responsable commercial (2.101.401)
Un seul guide, avec des encadrés réservés au responsable commercial
(💰 Ventes, programmer une installation, 👑 Mon équipe d'office).
« Ma journée » relue dans le code : le premier devis part du numéro BMI
(accès puis devis), la relance d'un prospect pose une question et nomme
le projet. Le contrôle des guides ne prête plus au commercial les
onglets réservés au technicien.

Co-Authored-By: Claude Opus 5.5 <noreply@anthropic.com>
Claude-Session: https://claude.ai/code/session_01V9FfE1ccQN1sKVjUyrAC9z
</commit_message>
<xml_diff>
--- a/docs/manuel/chapitre-01-connexion-securite-et-navigation.docx
+++ b/docs/manuel/chapitre-01-connexion-securite-et-navigation.docx
@@ -322,7 +322,7 @@
                 <w:sz w:val="20"/>
                 <w:szCs w:val="20"/>
               </w:rPr>
-              <w:t xml:space="preserve">2.101.400</w:t>
+              <w:t xml:space="preserve">2.101.401</w:t>
             </w:r>
           </w:p>
         </w:tc>
@@ -8570,7 +8570,7 @@
         <w:sz w:val="14"/>
         <w:szCs w:val="14"/>
       </w:rPr>
-      <w:t xml:space="preserve">Version 2.101.400 de l'application  ·  1er octobre 2026  ·  document interne BMI Togo</w:t>
+      <w:t xml:space="preserve">Version 2.101.401 de l'application  ·  1er octobre 2026  ·  document interne BMI Togo</w:t>
     </w:r>
   </w:p>
 </w:ftr>

</xml_diff>

<commit_message>
Guide du poste : technicien, à commission et BMI (2.101.402)
Un seul guide, avec des encadrés « seulement pour… ». « Ma journée »
relue dans le code : le registre de l'outillage est tenu par tout
technicien chef ⭐ (pas seulement le technicien BMI), le dossier de
chantier (photos, observations) et l'explication d'un retard d'outil
ajoutés, le chef de chantier distingué du chef d'équipe.

Co-Authored-By: Claude Opus 5.5 <noreply@anthropic.com>
Claude-Session: https://claude.ai/code/session_01V9FfE1ccQN1sKVjUyrAC9z
</commit_message>
<xml_diff>
--- a/docs/manuel/chapitre-01-connexion-securite-et-navigation.docx
+++ b/docs/manuel/chapitre-01-connexion-securite-et-navigation.docx
@@ -322,7 +322,7 @@
                 <w:sz w:val="20"/>
                 <w:szCs w:val="20"/>
               </w:rPr>
-              <w:t xml:space="preserve">2.101.401</w:t>
+              <w:t xml:space="preserve">2.101.402</w:t>
             </w:r>
           </w:p>
         </w:tc>
@@ -8570,7 +8570,7 @@
         <w:sz w:val="14"/>
         <w:szCs w:val="14"/>
       </w:rPr>
-      <w:t xml:space="preserve">Version 2.101.401 de l'application  ·  1er octobre 2026  ·  document interne BMI Togo</w:t>
+      <w:t xml:space="preserve">Version 2.101.402 de l'application  ·  1er octobre 2026  ·  document interne BMI Togo</w:t>
     </w:r>
   </w:p>
 </w:ftr>

</xml_diff>

<commit_message>
Guide du comptable, livret retiré, onglets alignés sur ONGLETS_ROLE (2.101.403)
- Guide du poste : le comptable (le pointage de sa caisse s'apprend en
  réel : « Chez le comptable » n'a pas de jumelle en formation).
- Le comptable n'a plus l'onglet 📲 WhatsApp dans son menu (retiré par
  décision du 20/09, il était resté et s'ouvrait vide).
- ONGLETS_ROLE suit les menus affichés : 🔁 Transfert (gérant), 💰 Ventes
  (resp. commercial), 🏠 Clients installés (vendeur) deviennent retirables
  dans 🔐 Pouvoirs ; 📤 Dépenses quitte la liste du vendeur. Un contrôle
  compare les deux listes rôle par rôle.
- Chapitre 2 : le responsable commercial a 💰 Ventes.
- Le livret de formation est retiré : les six guides par poste le
  remplacent.

Co-Authored-By: Claude Opus 5.5 <noreply@anthropic.com>
Claude-Session: https://claude.ai/code/session_01V9FfE1ccQN1sKVjUyrAC9z
</commit_message>
<xml_diff>
--- a/docs/manuel/chapitre-01-connexion-securite-et-navigation.docx
+++ b/docs/manuel/chapitre-01-connexion-securite-et-navigation.docx
@@ -322,7 +322,7 @@
                 <w:sz w:val="20"/>
                 <w:szCs w:val="20"/>
               </w:rPr>
-              <w:t xml:space="preserve">2.101.402</w:t>
+              <w:t xml:space="preserve">2.101.403</w:t>
             </w:r>
           </w:p>
         </w:tc>
@@ -8570,7 +8570,7 @@
         <w:sz w:val="14"/>
         <w:szCs w:val="14"/>
       </w:rPr>
-      <w:t xml:space="preserve">Version 2.101.402 de l'application  ·  1er octobre 2026  ·  document interne BMI Togo</w:t>
+      <w:t xml:space="preserve">Version 2.101.403 de l'application  ·  1er octobre 2026  ·  document interne BMI Togo</w:t>
     </w:r>
   </w:p>
 </w:ftr>

</xml_diff>

<commit_message>
Guide du poste : l'administrateur (2.101.404)
Sa journée (deux niveaux : l'administrateur, et l'administrateur
principal dans des encadrés), les 25 chapitres du manuel, et son examen
pratique (14 épreuves, 7 questions). Le contrôle des guides lit aussi
le menu de l'administrateur et le compare à ONGLETS_ROLE.

Co-Authored-By: Claude Opus 5.5 <noreply@anthropic.com>
Claude-Session: https://claude.ai/code/session_01V9FfE1ccQN1sKVjUyrAC9z
</commit_message>
<xml_diff>
--- a/docs/manuel/chapitre-01-connexion-securite-et-navigation.docx
+++ b/docs/manuel/chapitre-01-connexion-securite-et-navigation.docx
@@ -322,7 +322,7 @@
                 <w:sz w:val="20"/>
                 <w:szCs w:val="20"/>
               </w:rPr>
-              <w:t xml:space="preserve">2.101.403</w:t>
+              <w:t xml:space="preserve">2.101.404</w:t>
             </w:r>
           </w:p>
         </w:tc>
@@ -8570,7 +8570,7 @@
         <w:sz w:val="14"/>
         <w:szCs w:val="14"/>
       </w:rPr>
-      <w:t xml:space="preserve">Version 2.101.403 de l'application  ·  1er octobre 2026  ·  document interne BMI Togo</w:t>
+      <w:t xml:space="preserve">Version 2.101.404 de l'application  ·  1er octobre 2026  ·  document interne BMI Togo</w:t>
     </w:r>
   </w:p>
 </w:ftr>

</xml_diff>

<commit_message>
Assistant WhatsApp : le total calculé par l'application, et « Nos choix BMI » (2.101.406)
- calculer_total : l'application multiplie et additionne au prix du stock,
  boutique par boutique, articles seuls ; le juge n'accepte que ses montants,
  une quantité non dite est refusée.
- ⚙ Paramètres → 🤖 Assistant → 📝 Nos choix BMI (principal seul, sans prix) :
  l'assistant conseille selon ces choix plutôt qu'en général.
- Chapitres 20 et 23 du manuel à jour ; banc ㊷.

Co-Authored-By: Claude Opus 5.5 <noreply@anthropic.com>
Claude-Session: https://claude.ai/code/session_01V9FfE1ccQN1sKVjUyrAC9z
</commit_message>
<xml_diff>
--- a/docs/manuel/chapitre-01-connexion-securite-et-navigation.docx
+++ b/docs/manuel/chapitre-01-connexion-securite-et-navigation.docx
@@ -322,7 +322,7 @@
                 <w:sz w:val="20"/>
                 <w:szCs w:val="20"/>
               </w:rPr>
-              <w:t xml:space="preserve">2.101.404</w:t>
+              <w:t xml:space="preserve">2.101.406</w:t>
             </w:r>
           </w:p>
         </w:tc>
@@ -8570,7 +8570,7 @@
         <w:sz w:val="14"/>
         <w:szCs w:val="14"/>
       </w:rPr>
-      <w:t xml:space="preserve">Version 2.101.404 de l'application  ·  1er octobre 2026  ·  document interne BMI Togo</w:t>
+      <w:t xml:space="preserve">Version 2.101.406 de l'application  ·  1er octobre 2026  ·  document interne BMI Togo</w:t>
     </w:r>
   </w:p>
 </w:ftr>

</xml_diff>

<commit_message>
2.101.407 — l'assistant WhatsApp voit nos métiers, la fiche de tous les articles, et choisit une pompe
- le métier (nom du domaine) part avec chaque article et se cherche :
  « pompe de forage » trouve les pompes rangées dans Forage
- la fiche de tous les articles (puissance, garanties, conditions, fiche
  technique ; profondeur, débit en surface, hybride pour une pompe) —
  jamais prix d'achat, fournisseur, notes internes, code, seuil, quantité
- chercher_article retire les petits mots (règle du menu)
- sixième outil choisir_pompe : la règle du volet du devis (etudePompe),
  les pompes qui montent assez haut, jamais un débit promis à une hauteur
- consigne : conseil général d'abord, puis articles de notre stock ;
  métiers avec leurs familles (domainesPourIA)
- banc ㊸ (19 contrôles), éprouvé ; chapitres 8 et 20 à jour

Co-Authored-By: Claude Opus 5.5 <noreply@anthropic.com>
Claude-Session: https://claude.ai/code/session_01V9FfE1ccQN1sKVjUyrAC9z
</commit_message>
<xml_diff>
--- a/docs/manuel/chapitre-01-connexion-securite-et-navigation.docx
+++ b/docs/manuel/chapitre-01-connexion-securite-et-navigation.docx
@@ -322,7 +322,7 @@
                 <w:sz w:val="20"/>
                 <w:szCs w:val="20"/>
               </w:rPr>
-              <w:t xml:space="preserve">2.101.406</w:t>
+              <w:t xml:space="preserve">2.101.407</w:t>
             </w:r>
           </w:p>
         </w:tc>
@@ -8570,7 +8570,7 @@
         <w:sz w:val="14"/>
         <w:szCs w:val="14"/>
       </w:rPr>
-      <w:t xml:space="preserve">Version 2.101.406 de l'application  ·  1er octobre 2026  ·  document interne BMI Togo</w:t>
+      <w:t xml:space="preserve">Version 2.101.407 de l'application  ·  1er octobre 2026  ·  document interne BMI Togo</w:t>
     </w:r>
   </w:p>
 </w:ftr>

</xml_diff>

<commit_message>
2.101.408 — l'assistant WhatsApp reste dans la conversation
- une réponse jetée par le juge est réécrite une fois, avec la raison ;
  au milieu d'une conversation de l'IA, une phrase neutre au lieu du menu
- septième outil panneaux_pour_pompe : puissance × 1,3 ÷ le panneau le
  plus puissant du stock, prix par boutique ; choisir_pompe les donne aussi
- conseiller seulement si demandé ou nécessaire ; « assistant » ramène
  le client à l'assistant après un relais, et le relais le dit
- exemple d'appareils proposé quand demandé, calculs techniques permis,
  BMI présentée avec conviction, 51,2 V = 48 V dans la recherche,
  mémoire de 40 messages
- banc ㊹ (29 contrôles), éprouvé ; chapitre 20 à jour

Co-Authored-By: Claude Opus 5.5 <noreply@anthropic.com>
Claude-Session: https://claude.ai/code/session_01V9FfE1ccQN1sKVjUyrAC9z
</commit_message>
<xml_diff>
--- a/docs/manuel/chapitre-01-connexion-securite-et-navigation.docx
+++ b/docs/manuel/chapitre-01-connexion-securite-et-navigation.docx
@@ -322,7 +322,7 @@
                 <w:sz w:val="20"/>
                 <w:szCs w:val="20"/>
               </w:rPr>
-              <w:t xml:space="preserve">2.101.407</w:t>
+              <w:t xml:space="preserve">2.101.408</w:t>
             </w:r>
           </w:p>
         </w:tc>
@@ -8570,7 +8570,7 @@
         <w:sz w:val="14"/>
         <w:szCs w:val="14"/>
       </w:rPr>
-      <w:t xml:space="preserve">Version 2.101.407 de l'application  ·  1er octobre 2026  ·  document interne BMI Togo</w:t>
+      <w:t xml:space="preserve">Version 2.101.408 de l'application  ·  1er octobre 2026  ·  document interne BMI Togo</w:t>
     </w:r>
   </w:p>
 </w:ftr>

</xml_diff>

<commit_message>
2.101.409 — une discussion s'ouvre sur son dernier message
Timo : « quand tu ouvres une discussion, elle affiche le début, jamais la
fin ». useFilSurSaFin (ui.jsx), une règle pour 📲 WhatsApp et 💬 Messages :
la boîte du fil descend au dernier message à l'ouverture, suit les nouveaux
si l'on était en bas, ne tire pas vers le bas qui relit plus haut, ne fait
jamais défiler la page. Banc verifier-ecran-qui-se-montre (27), mesuré dans
Chromium avec témoin, éprouvé. Chapitre 20 du manuel à jour.

Co-Authored-By: Claude Opus 5.5 <noreply@anthropic.com>
Claude-Session: https://claude.ai/code/session_01V9FfE1ccQN1sKVjUyrAC9z
</commit_message>
<xml_diff>
--- a/docs/manuel/chapitre-01-connexion-securite-et-navigation.docx
+++ b/docs/manuel/chapitre-01-connexion-securite-et-navigation.docx
@@ -322,7 +322,7 @@
                 <w:sz w:val="20"/>
                 <w:szCs w:val="20"/>
               </w:rPr>
-              <w:t xml:space="preserve">2.101.408</w:t>
+              <w:t xml:space="preserve">2.101.409</w:t>
             </w:r>
           </w:p>
         </w:tc>
@@ -8570,7 +8570,7 @@
         <w:sz w:val="14"/>
         <w:szCs w:val="14"/>
       </w:rPr>
-      <w:t xml:space="preserve">Version 2.101.408 de l'application  ·  1er octobre 2026  ·  document interne BMI Togo</w:t>
+      <w:t xml:space="preserve">Version 2.101.409 de l'application  ·  1er octobre 2026  ·  document interne BMI Togo</w:t>
     </w:r>
   </w:p>
 </w:ftr>

</xml_diff>

<commit_message>
2.101.410 — envoyer un fichier au client depuis 📲 WhatsApp
Timo : « ajouter la possibilité d'envoyer les fichiers » → tous les
documents, phrase facultative. Bouton 📎 : photo (réduite dans le
navigateur), PDF, Word, Excel, PowerPoint, texte, vidéo, son — 3 Mo au
plus. C'est une réponse : fenêtre de 24 h, mêmes personnes, jamais en
formation, revérifié dans le geste et par le serveur, qui remesure le
fichier. Rien n'est rangé : déposé chez WhatsApp puis cité ; le fil garde
le nom seul. Banc ㊺ (19), éprouvé ; deux contrôles retournés. Chapitre
20 du manuel à jour.

Co-Authored-By: Claude Opus 5.5 <noreply@anthropic.com>
Claude-Session: https://claude.ai/code/session_01V9FfE1ccQN1sKVjUyrAC9z
</commit_message>
<xml_diff>
--- a/docs/manuel/chapitre-01-connexion-securite-et-navigation.docx
+++ b/docs/manuel/chapitre-01-connexion-securite-et-navigation.docx
@@ -322,7 +322,7 @@
                 <w:sz w:val="20"/>
                 <w:szCs w:val="20"/>
               </w:rPr>
-              <w:t xml:space="preserve">2.101.409</w:t>
+              <w:t xml:space="preserve">2.101.410</w:t>
             </w:r>
           </w:p>
         </w:tc>
@@ -8570,7 +8570,7 @@
         <w:sz w:val="14"/>
         <w:szCs w:val="14"/>
       </w:rPr>
-      <w:t xml:space="preserve">Version 2.101.409 de l'application  ·  1er octobre 2026  ·  document interne BMI Togo</w:t>
+      <w:t xml:space="preserve">Version 2.101.410 de l'application  ·  1er octobre 2026  ·  document interne BMI Togo</w:t>
     </w:r>
   </w:p>
 </w:ftr>

</xml_diff>

<commit_message>
2.101.411 — La caisse de terrain sort du tableau des boutiques
Dans ⚙ Paramètres → Boutiques, la caisse TERRAIN s'affichait comme une
« Boutique de vente », avec « En faire un magasin », la suppression, le
loyer et le logo. Elle a maintenant son cadre à part sous le tableau,
avec seulement Infos reçu, Fonds de caisse, Comptes mobiles et le
préfixe des reçus ; les gestes qui ne la concernent pas la refusent.
Rien ne bouge dans la base. Chapitre 23 du manuel à jour.

Co-Authored-By: Claude Opus 5.5 <noreply@anthropic.com>
Claude-Session: https://claude.ai/code/session_01V9FfE1ccQN1sKVjUyrAC9z
</commit_message>
<xml_diff>
--- a/docs/manuel/chapitre-01-connexion-securite-et-navigation.docx
+++ b/docs/manuel/chapitre-01-connexion-securite-et-navigation.docx
@@ -322,7 +322,7 @@
                 <w:sz w:val="20"/>
                 <w:szCs w:val="20"/>
               </w:rPr>
-              <w:t xml:space="preserve">2.101.410</w:t>
+              <w:t xml:space="preserve">2.101.411</w:t>
             </w:r>
           </w:p>
         </w:tc>
@@ -8570,7 +8570,7 @@
         <w:sz w:val="14"/>
         <w:szCs w:val="14"/>
       </w:rPr>
-      <w:t xml:space="preserve">Version 2.101.410 de l'application  ·  1er octobre 2026  ·  document interne BMI Togo</w:t>
+      <w:t xml:space="preserve">Version 2.101.411 de l'application  ·  1er octobre 2026  ·  document interne BMI Togo</w:t>
     </w:r>
   </w:p>
 </w:ftr>

</xml_diff>

<commit_message>
Payer une personne : « D'où sort l'argent ? » — caisse de boutique, Chez le DG, Chez le comptable, ou la banque pour un virement (2.101.412)
Salaire, commissions de Mon équipe, avance et crédit BMI passent par une
seule question (choisirSourcePaiementG). En espèces, une boutique ne paie
pas plus que son tiroir. Une retenue de crédit se lit en entrée dans les
relevés DG et BANQUE. Chapitres 16 et 18 du manuel à jour.

Co-Authored-By: Claude Opus 5.5 <noreply@anthropic.com>
Claude-Session: https://claude.ai/code/session_01V9FfE1ccQN1sKVjUyrAC9z
</commit_message>
<xml_diff>
--- a/docs/manuel/chapitre-01-connexion-securite-et-navigation.docx
+++ b/docs/manuel/chapitre-01-connexion-securite-et-navigation.docx
@@ -322,7 +322,7 @@
                 <w:sz w:val="20"/>
                 <w:szCs w:val="20"/>
               </w:rPr>
-              <w:t xml:space="preserve">2.101.411</w:t>
+              <w:t xml:space="preserve">2.101.412</w:t>
             </w:r>
           </w:p>
         </w:tc>
@@ -8570,7 +8570,7 @@
         <w:sz w:val="14"/>
         <w:szCs w:val="14"/>
       </w:rPr>
-      <w:t xml:space="preserve">Version 2.101.411 de l'application  ·  1er octobre 2026  ·  document interne BMI Togo</w:t>
+      <w:t xml:space="preserve">Version 2.101.412 de l'application  ·  1er octobre 2026  ·  document interne BMI Togo</w:t>
     </w:r>
   </w:p>
 </w:ftr>

</xml_diff>

<commit_message>
Crédit BMI d'avant l'application (sans sortie de caisse), correction d'un crédit approuvé par erreur, et un prêt au personnel n'est plus une charge (2.101.413)
Le geste « Crédit d'avant l'application » enregistre ce qui reste dû sans
toucher aucune caisse ; « Date d'avant l'application » retire la sortie de
caisse d'un crédit approuvé à tort en gardant le crédit. Le prêt au
personnel sort des charges et s'écrit en 421 au journal. Chapitres 17 et
18 du manuel à jour.

Co-Authored-By: Claude Opus 5.5 <noreply@anthropic.com>
Claude-Session: https://claude.ai/code/session_01V9FfE1ccQN1sKVjUyrAC9z
</commit_message>
<xml_diff>
--- a/docs/manuel/chapitre-01-connexion-securite-et-navigation.docx
+++ b/docs/manuel/chapitre-01-connexion-securite-et-navigation.docx
@@ -322,7 +322,7 @@
                 <w:sz w:val="20"/>
                 <w:szCs w:val="20"/>
               </w:rPr>
-              <w:t xml:space="preserve">2.101.412</w:t>
+              <w:t xml:space="preserve">2.101.413</w:t>
             </w:r>
           </w:p>
         </w:tc>
@@ -8570,7 +8570,7 @@
         <w:sz w:val="14"/>
         <w:szCs w:val="14"/>
       </w:rPr>
-      <w:t xml:space="preserve">Version 2.101.412 de l'application  ·  1er octobre 2026  ·  document interne BMI Togo</w:t>
+      <w:t xml:space="preserve">Version 2.101.413 de l'application  ·  1er octobre 2026  ·  document interne BMI Togo</w:t>
     </w:r>
   </w:p>
 </w:ftr>

</xml_diff>

<commit_message>
Un virement demande aussi d'où sort l'argent : banque, DG ou comptable (2.101.414)
Co-Authored-By: Claude Opus 5.5 <noreply@anthropic.com>
Claude-Session: https://claude.ai/code/session_01V9FfE1ccQN1sKVjUyrAC9z
</commit_message>
<xml_diff>
--- a/docs/manuel/chapitre-01-connexion-securite-et-navigation.docx
+++ b/docs/manuel/chapitre-01-connexion-securite-et-navigation.docx
@@ -322,7 +322,7 @@
                 <w:sz w:val="20"/>
                 <w:szCs w:val="20"/>
               </w:rPr>
-              <w:t xml:space="preserve">2.101.413</w:t>
+              <w:t xml:space="preserve">2.101.414</w:t>
             </w:r>
           </w:p>
         </w:tc>
@@ -8570,7 +8570,7 @@
         <w:sz w:val="14"/>
         <w:szCs w:val="14"/>
       </w:rPr>
-      <w:t xml:space="preserve">Version 2.101.413 de l'application  ·  1er octobre 2026  ·  document interne BMI Togo</w:t>
+      <w:t xml:space="preserve">Version 2.101.414 de l'application  ·  1er octobre 2026  ·  document interne BMI Togo</w:t>
     </w:r>
   </w:p>
 </w:ftr>

</xml_diff>

<commit_message>
Crédits BMI : retirer un crédit saisi par erreur, la retenue sur salaire ne bloque plus la correction, les prêts revisibles dans Dépenses (2.101.415)
Co-Authored-By: Claude Opus 5.5 <noreply@anthropic.com>
Claude-Session: https://claude.ai/code/session_01V9FfE1ccQN1sKVjUyrAC9z
</commit_message>
<xml_diff>
--- a/docs/manuel/chapitre-01-connexion-securite-et-navigation.docx
+++ b/docs/manuel/chapitre-01-connexion-securite-et-navigation.docx
@@ -322,7 +322,7 @@
                 <w:sz w:val="20"/>
                 <w:szCs w:val="20"/>
               </w:rPr>
-              <w:t xml:space="preserve">2.101.414</w:t>
+              <w:t xml:space="preserve">2.101.415</w:t>
             </w:r>
           </w:p>
         </w:tc>
@@ -8570,7 +8570,7 @@
         <w:sz w:val="14"/>
         <w:szCs w:val="14"/>
       </w:rPr>
-      <w:t xml:space="preserve">Version 2.101.414 de l'application  ·  1er octobre 2026  ·  document interne BMI Togo</w:t>
+      <w:t xml:space="preserve">Version 2.101.415 de l'application  ·  1er octobre 2026  ·  document interne BMI Togo</w:t>
     </w:r>
   </w:p>
 </w:ftr>

</xml_diff>

<commit_message>
Salaire : ce qui est sorti de la caisse se lit sous la charge ; le journal ouvre un crédit d'avant l'application (2.101.416)
Co-Authored-By: Claude Opus 5.5 <noreply@anthropic.com>
Claude-Session: https://claude.ai/code/session_01V9FfE1ccQN1sKVjUyrAC9z
</commit_message>
<xml_diff>
--- a/docs/manuel/chapitre-01-connexion-securite-et-navigation.docx
+++ b/docs/manuel/chapitre-01-connexion-securite-et-navigation.docx
@@ -322,7 +322,7 @@
                 <w:sz w:val="20"/>
                 <w:szCs w:val="20"/>
               </w:rPr>
-              <w:t xml:space="preserve">2.101.415</w:t>
+              <w:t xml:space="preserve">2.101.416</w:t>
             </w:r>
           </w:p>
         </w:tc>
@@ -8570,7 +8570,7 @@
         <w:sz w:val="14"/>
         <w:szCs w:val="14"/>
       </w:rPr>
-      <w:t xml:space="preserve">Version 2.101.415 de l'application  ·  1er octobre 2026  ·  document interne BMI Togo</w:t>
+      <w:t xml:space="preserve">Version 2.101.416 de l'application  ·  1er octobre 2026  ·  document interne BMI Togo</w:t>
     </w:r>
   </w:p>
 </w:ftr>

</xml_diff>

<commit_message>
Crédits BMI : une retenue déjà prise sur un salaire ne disparaît plus avec un crédit retiré, et se rattache (2.101.417)
Co-Authored-By: Claude Opus 5.5 <noreply@anthropic.com>
Claude-Session: https://claude.ai/code/session_01V9FfE1ccQN1sKVjUyrAC9z
</commit_message>
<xml_diff>
--- a/docs/manuel/chapitre-01-connexion-securite-et-navigation.docx
+++ b/docs/manuel/chapitre-01-connexion-securite-et-navigation.docx
@@ -322,7 +322,7 @@
                 <w:sz w:val="20"/>
                 <w:szCs w:val="20"/>
               </w:rPr>
-              <w:t xml:space="preserve">2.101.416</w:t>
+              <w:t xml:space="preserve">2.101.417</w:t>
             </w:r>
           </w:p>
         </w:tc>
@@ -8570,7 +8570,7 @@
         <w:sz w:val="14"/>
         <w:szCs w:val="14"/>
       </w:rPr>
-      <w:t xml:space="preserve">Version 2.101.416 de l'application  ·  1er octobre 2026  ·  document interne BMI Togo</w:t>
+      <w:t xml:space="preserve">Version 2.101.417 de l'application  ·  1er octobre 2026  ·  document interne BMI Togo</w:t>
     </w:r>
   </w:p>
 </w:ftr>

</xml_diff>

<commit_message>
L'avis de paiement d'un salaire part du numéro BMI, modèle virement_salaire (2.101.418)
Co-Authored-By: Claude Opus 5.5 <noreply@anthropic.com>
Claude-Session: https://claude.ai/code/session_01V9FfE1ccQN1sKVjUyrAC9z
</commit_message>
<xml_diff>
--- a/docs/manuel/chapitre-01-connexion-securite-et-navigation.docx
+++ b/docs/manuel/chapitre-01-connexion-securite-et-navigation.docx
@@ -322,7 +322,7 @@
                 <w:sz w:val="20"/>
                 <w:szCs w:val="20"/>
               </w:rPr>
-              <w:t xml:space="preserve">2.101.417</w:t>
+              <w:t xml:space="preserve">2.101.418</w:t>
             </w:r>
           </w:p>
         </w:tc>
@@ -8570,7 +8570,7 @@
         <w:sz w:val="14"/>
         <w:szCs w:val="14"/>
       </w:rPr>
-      <w:t xml:space="preserve">Version 2.101.417 de l'application  ·  1er octobre 2026  ·  document interne BMI Togo</w:t>
+      <w:t xml:space="preserve">Version 2.101.418 de l'application  ·  1er octobre 2026  ·  document interne BMI Togo</w:t>
     </w:r>
   </w:p>
 </w:ftr>

</xml_diff>

<commit_message>
Avis de salaire : « votre salaire du mois de … » (2.101.419)
Co-Authored-By: Claude Opus 5.5 <noreply@anthropic.com>
Claude-Session: https://claude.ai/code/session_01V9FfE1ccQN1sKVjUyrAC9z
</commit_message>
<xml_diff>
--- a/docs/manuel/chapitre-01-connexion-securite-et-navigation.docx
+++ b/docs/manuel/chapitre-01-connexion-securite-et-navigation.docx
@@ -322,7 +322,7 @@
                 <w:sz w:val="20"/>
                 <w:szCs w:val="20"/>
               </w:rPr>
-              <w:t xml:space="preserve">2.101.418</w:t>
+              <w:t xml:space="preserve">2.101.419</w:t>
             </w:r>
           </w:p>
         </w:tc>
@@ -8570,7 +8570,7 @@
         <w:sz w:val="14"/>
         <w:szCs w:val="14"/>
       </w:rPr>
-      <w:t xml:space="preserve">Version 2.101.418 de l'application  ·  1er octobre 2026  ·  document interne BMI Togo</w:t>
+      <w:t xml:space="preserve">Version 2.101.419 de l'application  ·  1er octobre 2026  ·  document interne BMI Togo</w:t>
     </w:r>
   </w:p>
 </w:ftr>

</xml_diff>

<commit_message>
Avis de salaire : le texte tel que créé chez YCloud (2.101.420)
Co-Authored-By: Claude Opus 5.5 <noreply@anthropic.com>
Claude-Session: https://claude.ai/code/session_01V9FfE1ccQN1sKVjUyrAC9z
</commit_message>
<xml_diff>
--- a/docs/manuel/chapitre-01-connexion-securite-et-navigation.docx
+++ b/docs/manuel/chapitre-01-connexion-securite-et-navigation.docx
@@ -322,7 +322,7 @@
                 <w:sz w:val="20"/>
                 <w:szCs w:val="20"/>
               </w:rPr>
-              <w:t xml:space="preserve">2.101.419</w:t>
+              <w:t xml:space="preserve">2.101.420</w:t>
             </w:r>
           </w:p>
         </w:tc>
@@ -8570,7 +8570,7 @@
         <w:sz w:val="14"/>
         <w:szCs w:val="14"/>
       </w:rPr>
-      <w:t xml:space="preserve">Version 2.101.419 de l'application  ·  1er octobre 2026  ·  document interne BMI Togo</w:t>
+      <w:t xml:space="preserve">Version 2.101.420 de l'application  ·  1er octobre 2026  ·  document interne BMI Togo</w:t>
     </w:r>
   </w:p>
 </w:ftr>

</xml_diff>

<commit_message>
Avis de salaire avec crédit BMI : salaire, retenue, versé et reste à rembourser, modèle virement_salaire_credit (2.101.421)
Co-Authored-By: Claude Opus 5.5 <noreply@anthropic.com>
Claude-Session: https://claude.ai/code/session_01V9FfE1ccQN1sKVjUyrAC9z
</commit_message>
<xml_diff>
--- a/docs/manuel/chapitre-01-connexion-securite-et-navigation.docx
+++ b/docs/manuel/chapitre-01-connexion-securite-et-navigation.docx
@@ -322,7 +322,7 @@
                 <w:sz w:val="20"/>
                 <w:szCs w:val="20"/>
               </w:rPr>
-              <w:t xml:space="preserve">2.101.420</w:t>
+              <w:t xml:space="preserve">2.101.421</w:t>
             </w:r>
           </w:p>
         </w:tc>
@@ -8570,7 +8570,7 @@
         <w:sz w:val="14"/>
         <w:szCs w:val="14"/>
       </w:rPr>
-      <w:t xml:space="preserve">Version 2.101.420 de l'application  ·  1er octobre 2026  ·  document interne BMI Togo</w:t>
+      <w:t xml:space="preserve">Version 2.101.421 de l'application  ·  1er octobre 2026  ·  document interne BMI Togo</w:t>
     </w:r>
   </w:p>
 </w:ftr>

</xml_diff>

<commit_message>
2.101.422 — l'avis « commission due » part du numéro BMI (commercial, responsable, parrain, apporteur externe)
Co-Authored-By: Claude Opus 5.5 <noreply@anthropic.com>
Claude-Session: https://claude.ai/code/session_01V9FfE1ccQN1sKVjUyrAC9z
</commit_message>
<xml_diff>
--- a/docs/manuel/chapitre-01-connexion-securite-et-navigation.docx
+++ b/docs/manuel/chapitre-01-connexion-securite-et-navigation.docx
@@ -322,7 +322,7 @@
                 <w:sz w:val="20"/>
                 <w:szCs w:val="20"/>
               </w:rPr>
-              <w:t xml:space="preserve">2.101.421</w:t>
+              <w:t xml:space="preserve">2.101.422</w:t>
             </w:r>
           </w:p>
         </w:tc>
@@ -8570,7 +8570,7 @@
         <w:sz w:val="14"/>
         <w:szCs w:val="14"/>
       </w:rPr>
-      <w:t xml:space="preserve">Version 2.101.421 de l'application  ·  1er octobre 2026  ·  document interne BMI Togo</w:t>
+      <w:t xml:space="preserve">Version 2.101.422 de l'application  ·  1er octobre 2026  ·  document interne BMI Togo</w:t>
     </w:r>
   </w:p>
 </w:ftr>

</xml_diff>

<commit_message>
Anniversaires des employés : rappel de la veille à 17 h au principal, vœux du numéro BMI le jour même (2.101.423)
Co-Authored-By: Claude Opus 5.5 <noreply@anthropic.com>
Claude-Session: https://claude.ai/code/session_01V9FfE1ccQN1sKVjUyrAC9z
</commit_message>
<xml_diff>
--- a/docs/manuel/chapitre-01-connexion-securite-et-navigation.docx
+++ b/docs/manuel/chapitre-01-connexion-securite-et-navigation.docx
@@ -322,7 +322,7 @@
                 <w:sz w:val="20"/>
                 <w:szCs w:val="20"/>
               </w:rPr>
-              <w:t xml:space="preserve">2.101.422</w:t>
+              <w:t xml:space="preserve">2.101.423</w:t>
             </w:r>
           </w:p>
         </w:tc>
@@ -8570,7 +8570,7 @@
         <w:sz w:val="14"/>
         <w:szCs w:val="14"/>
       </w:rPr>
-      <w:t xml:space="preserve">Version 2.101.422 de l'application  ·  1er octobre 2026  ·  document interne BMI Togo</w:t>
+      <w:t xml:space="preserve">Version 2.101.423 de l'application  ·  1er octobre 2026  ·  document interne BMI Togo</w:t>
     </w:r>
   </w:p>
 </w:ftr>

</xml_diff>

<commit_message>
Anniversaires : rappel de la veille aussi par WhatsApp à l'administrateur ; commission due : la part des frais d'installation du technicien (2.101.424)
Co-Authored-By: Claude Opus 5.5 <noreply@anthropic.com>
Claude-Session: https://claude.ai/code/session_01V9FfE1ccQN1sKVjUyrAC9z
</commit_message>
<xml_diff>
--- a/docs/manuel/chapitre-01-connexion-securite-et-navigation.docx
+++ b/docs/manuel/chapitre-01-connexion-securite-et-navigation.docx
@@ -322,7 +322,7 @@
                 <w:sz w:val="20"/>
                 <w:szCs w:val="20"/>
               </w:rPr>
-              <w:t xml:space="preserve">2.101.423</w:t>
+              <w:t xml:space="preserve">2.101.424</w:t>
             </w:r>
           </w:p>
         </w:tc>
@@ -8570,7 +8570,7 @@
         <w:sz w:val="14"/>
         <w:szCs w:val="14"/>
       </w:rPr>
-      <w:t xml:space="preserve">Version 2.101.423 de l'application  ·  1er octobre 2026  ·  document interne BMI Togo</w:t>
+      <w:t xml:space="preserve">Version 2.101.424 de l'application  ·  1er octobre 2026  ·  document interne BMI Togo</w:t>
     </w:r>
   </w:p>
 </w:ftr>

</xml_diff>

<commit_message>
Avis d'avancement d'un employé du numéro BMI (2.101.425)
Co-Authored-By: Claude Opus 5.5 <noreply@anthropic.com>
Claude-Session: https://claude.ai/code/session_01V9FfE1ccQN1sKVjUyrAC9z
</commit_message>
<xml_diff>
--- a/docs/manuel/chapitre-01-connexion-securite-et-navigation.docx
+++ b/docs/manuel/chapitre-01-connexion-securite-et-navigation.docx
@@ -322,7 +322,7 @@
                 <w:sz w:val="20"/>
                 <w:szCs w:val="20"/>
               </w:rPr>
-              <w:t xml:space="preserve">2.101.424</w:t>
+              <w:t xml:space="preserve">2.101.425</w:t>
             </w:r>
           </w:p>
         </w:tc>
@@ -8570,7 +8570,7 @@
         <w:sz w:val="14"/>
         <w:szCs w:val="14"/>
       </w:rPr>
-      <w:t xml:space="preserve">Version 2.101.424 de l'application  ·  1er octobre 2026  ·  document interne BMI Togo</w:t>
+      <w:t xml:space="preserve">Version 2.101.425 de l'application  ·  1er octobre 2026  ·  document interne BMI Togo</w:t>
     </w:r>
   </w:p>
 </w:ftr>

</xml_diff>

<commit_message>
Un compte qui n'a reçu qu'un devis est un prospect, pas un client (2.101.426)
👥 Utilisateurs : les comptes sans suite quittent la liste des clients, bloc
« 🧲 Prospects », mot de fidélité refusé à un prospect. 🧲 Prospects : cadre
« Comptes avec devis, rien acheté ». Chapitres 2, 3 et 4 du manuel à jour.

Co-Authored-By: Claude Opus 5.5 <noreply@anthropic.com>
Claude-Session: https://claude.ai/code/session_01V9FfE1ccQN1sKVjUyrAC9z
</commit_message>
<xml_diff>
--- a/docs/manuel/chapitre-01-connexion-securite-et-navigation.docx
+++ b/docs/manuel/chapitre-01-connexion-securite-et-navigation.docx
@@ -322,7 +322,7 @@
                 <w:sz w:val="20"/>
                 <w:szCs w:val="20"/>
               </w:rPr>
-              <w:t xml:space="preserve">2.101.425</w:t>
+              <w:t xml:space="preserve">2.101.426</w:t>
             </w:r>
           </w:p>
         </w:tc>
@@ -8570,7 +8570,7 @@
         <w:sz w:val="14"/>
         <w:szCs w:val="14"/>
       </w:rPr>
-      <w:t xml:space="preserve">Version 2.101.425 de l'application  ·  1er octobre 2026  ·  document interne BMI Togo</w:t>
+      <w:t xml:space="preserve">Version 2.101.426 de l'application  ·  1er octobre 2026  ·  document interne BMI Togo</w:t>
     </w:r>
   </w:p>
 </w:ftr>

</xml_diff>

<commit_message>
Le filtre des fidèles dans 👤 Clients (2.101.427)
« Tous les clients » ou « ⭐ Fidèles — 2, 3, 5 ou 10 achats ou plus ».
Chapitre 3 du manuel à jour.

Co-Authored-By: Claude Opus 5.5 <noreply@anthropic.com>
Claude-Session: https://claude.ai/code/session_01V9FfE1ccQN1sKVjUyrAC9z
</commit_message>
<xml_diff>
--- a/docs/manuel/chapitre-01-connexion-securite-et-navigation.docx
+++ b/docs/manuel/chapitre-01-connexion-securite-et-navigation.docx
@@ -322,7 +322,7 @@
                 <w:sz w:val="20"/>
                 <w:szCs w:val="20"/>
               </w:rPr>
-              <w:t xml:space="preserve">2.101.426</w:t>
+              <w:t xml:space="preserve">2.101.427</w:t>
             </w:r>
           </w:p>
         </w:tc>
@@ -8570,7 +8570,7 @@
         <w:sz w:val="14"/>
         <w:szCs w:val="14"/>
       </w:rPr>
-      <w:t xml:space="preserve">Version 2.101.426 de l'application  ·  1er octobre 2026  ·  document interne BMI Togo</w:t>
+      <w:t xml:space="preserve">Version 2.101.427 de l'application  ·  1er octobre 2026  ·  document interne BMI Togo</w:t>
     </w:r>
   </w:p>
 </w:ftr>

</xml_diff>

<commit_message>
🧲 Comptes avec devis : du plus nouveau au plus ancien (2.101.428)
Chapitre 4 du manuel à jour.

Co-Authored-By: Claude Opus 5.5 <noreply@anthropic.com>
Claude-Session: https://claude.ai/code/session_01V9FfE1ccQN1sKVjUyrAC9z
</commit_message>
<xml_diff>
--- a/docs/manuel/chapitre-01-connexion-securite-et-navigation.docx
+++ b/docs/manuel/chapitre-01-connexion-securite-et-navigation.docx
@@ -322,7 +322,7 @@
                 <w:sz w:val="20"/>
                 <w:szCs w:val="20"/>
               </w:rPr>
-              <w:t xml:space="preserve">2.101.427</w:t>
+              <w:t xml:space="preserve">2.101.428</w:t>
             </w:r>
           </w:p>
         </w:tc>
@@ -8570,7 +8570,7 @@
         <w:sz w:val="14"/>
         <w:szCs w:val="14"/>
       </w:rPr>
-      <w:t xml:space="preserve">Version 2.101.427 de l'application  ·  1er octobre 2026  ·  document interne BMI Togo</w:t>
+      <w:t xml:space="preserve">Version 2.101.428 de l'application  ·  1er octobre 2026  ·  document interne BMI Togo</w:t>
     </w:r>
   </w:p>
 </w:ftr>

</xml_diff>

<commit_message>
Salaires : les mois d'avant le suivi dans l'application ne sont plus proposés (2.101.429)
Case « Paie suivie depuis » (premier mois de paie suivi), sinon le premier
versement, prime ou avance enregistré ; un argent enregistré n'est jamais
caché. 💵 Salaires ne compte plus un employé pas encore suivi. Chapitre 18.

Co-Authored-By: Claude Opus 5.5 <noreply@anthropic.com>
Claude-Session: https://claude.ai/code/session_01V9FfE1ccQN1sKVjUyrAC9z
</commit_message>
<xml_diff>
--- a/docs/manuel/chapitre-01-connexion-securite-et-navigation.docx
+++ b/docs/manuel/chapitre-01-connexion-securite-et-navigation.docx
@@ -322,7 +322,7 @@
                 <w:sz w:val="20"/>
                 <w:szCs w:val="20"/>
               </w:rPr>
-              <w:t xml:space="preserve">2.101.428</w:t>
+              <w:t xml:space="preserve">2.101.429</w:t>
             </w:r>
           </w:p>
         </w:tc>
@@ -8570,7 +8570,7 @@
         <w:sz w:val="14"/>
         <w:szCs w:val="14"/>
       </w:rPr>
-      <w:t xml:space="preserve">Version 2.101.428 de l'application  ·  1er octobre 2026  ·  document interne BMI Togo</w:t>
+      <w:t xml:space="preserve">Version 2.101.429 de l'application  ·  1er octobre 2026  ·  document interne BMI Togo</w:t>
     </w:r>
   </w:p>
 </w:ftr>

</xml_diff>

<commit_message>
Utilisateurs : « Comptes prospects » et « Clients archivés » deviennent des boutons de la rangée des rôles (2.101.430)
Les deux blocs sous la liste se lisaient comme la suite de la fiche ouverte.
Les comptes s'ouvrent désormais dans le même tableau, avec tous leurs gestes,
et la date du dernier devis et de l'archive sous le nom. Chapitres 2 et 3.

Co-Authored-By: Claude Opus 5.5 <noreply@anthropic.com>
Claude-Session: https://claude.ai/code/session_01V9FfE1ccQN1sKVjUyrAC9z
</commit_message>
<xml_diff>
--- a/docs/manuel/chapitre-01-connexion-securite-et-navigation.docx
+++ b/docs/manuel/chapitre-01-connexion-securite-et-navigation.docx
@@ -322,7 +322,7 @@
                 <w:sz w:val="20"/>
                 <w:szCs w:val="20"/>
               </w:rPr>
-              <w:t xml:space="preserve">2.101.429</w:t>
+              <w:t xml:space="preserve">2.101.430</w:t>
             </w:r>
           </w:p>
         </w:tc>
@@ -8570,7 +8570,7 @@
         <w:sz w:val="14"/>
         <w:szCs w:val="14"/>
       </w:rPr>
-      <w:t xml:space="preserve">Version 2.101.429 de l'application  ·  1er octobre 2026  ·  document interne BMI Togo</w:t>
+      <w:t xml:space="preserve">Version 2.101.430 de l'application  ·  1er octobre 2026  ·  document interne BMI Togo</w:t>
     </w:r>
   </w:p>
 </w:ftr>

</xml_diff>

<commit_message>
Utilisateurs : les comptes sans devis ni achat ont leur bouton « Comptes sans activité » (2.101.431)
Co-Authored-By: Claude Opus 5.5 <noreply@anthropic.com>
Claude-Session: https://claude.ai/code/session_01V9FfE1ccQN1sKVjUyrAC9z
</commit_message>
<xml_diff>
--- a/docs/manuel/chapitre-01-connexion-securite-et-navigation.docx
+++ b/docs/manuel/chapitre-01-connexion-securite-et-navigation.docx
@@ -322,7 +322,7 @@
                 <w:sz w:val="20"/>
                 <w:szCs w:val="20"/>
               </w:rPr>
-              <w:t xml:space="preserve">2.101.430</w:t>
+              <w:t xml:space="preserve">2.101.431</w:t>
             </w:r>
           </w:p>
         </w:tc>
@@ -8570,7 +8570,7 @@
         <w:sz w:val="14"/>
         <w:szCs w:val="14"/>
       </w:rPr>
-      <w:t xml:space="preserve">Version 2.101.430 de l'application  ·  1er octobre 2026  ·  document interne BMI Togo</w:t>
+      <w:t xml:space="preserve">Version 2.101.431 de l'application  ·  1er octobre 2026  ·  document interne BMI Togo</w:t>
     </w:r>
   </w:p>
 </w:ftr>

</xml_diff>

<commit_message>
Clients : un clic ouvre la fiche du client — achats, dettes, proformas, commandes, devis, chantiers de toutes les boutiques de l'espace (2.101.432)
Co-Authored-By: Claude Opus 5.5 <noreply@anthropic.com>
Claude-Session: https://claude.ai/code/session_01V9FfE1ccQN1sKVjUyrAC9z
</commit_message>
<xml_diff>
--- a/docs/manuel/chapitre-01-connexion-securite-et-navigation.docx
+++ b/docs/manuel/chapitre-01-connexion-securite-et-navigation.docx
@@ -322,7 +322,7 @@
                 <w:sz w:val="20"/>
                 <w:szCs w:val="20"/>
               </w:rPr>
-              <w:t xml:space="preserve">2.101.431</w:t>
+              <w:t xml:space="preserve">2.101.432</w:t>
             </w:r>
           </w:p>
         </w:tc>
@@ -8570,7 +8570,7 @@
         <w:sz w:val="14"/>
         <w:szCs w:val="14"/>
       </w:rPr>
-      <w:t xml:space="preserve">Version 2.101.431 de l'application  ·  1er octobre 2026  ·  document interne BMI Togo</w:t>
+      <w:t xml:space="preserve">Version 2.101.432 de l'application  ·  1er octobre 2026  ·  document interne BMI Togo</w:t>
     </w:r>
   </w:p>
 </w:ftr>

</xml_diff>

<commit_message>
Dépenses, Dettes, Tous les devis : le filtre de période de Ventes, écrit une fois pour les quatre écrans (2.101.433)
Co-Authored-By: Claude Opus 5.5 <noreply@anthropic.com>
Claude-Session: https://claude.ai/code/session_01V9FfE1ccQN1sKVjUyrAC9z
</commit_message>
<xml_diff>
--- a/docs/manuel/chapitre-01-connexion-securite-et-navigation.docx
+++ b/docs/manuel/chapitre-01-connexion-securite-et-navigation.docx
@@ -322,7 +322,7 @@
                 <w:sz w:val="20"/>
                 <w:szCs w:val="20"/>
               </w:rPr>
-              <w:t xml:space="preserve">2.101.432</w:t>
+              <w:t xml:space="preserve">2.101.433</w:t>
             </w:r>
           </w:p>
         </w:tc>
@@ -8570,7 +8570,7 @@
         <w:sz w:val="14"/>
         <w:szCs w:val="14"/>
       </w:rPr>
-      <w:t xml:space="preserve">Version 2.101.432 de l'application  ·  1er octobre 2026  ·  document interne BMI Togo</w:t>
+      <w:t xml:space="preserve">Version 2.101.433 de l'application  ·  1er octobre 2026  ·  document interne BMI Togo</w:t>
     </w:r>
   </w:p>
 </w:ftr>

</xml_diff>

<commit_message>
2.101.434 — 🧲 Prospects : le filtre de période (Toute période à chaque ouverture)
La liste suit la date du prospect, les comptes avec devis celle de leur
dernier devis ; le compteur À relancer reste une alerte, il regarde tout.
Banc : un contrôle ajouté (éprouvé), un retourné. Chapitre 4 à jour.

Co-Authored-By: Claude Opus 5.5 <noreply@anthropic.com>
Claude-Session: https://claude.ai/code/session_01V9FfE1ccQN1sKVjUyrAC9z
</commit_message>
<xml_diff>
--- a/docs/manuel/chapitre-01-connexion-securite-et-navigation.docx
+++ b/docs/manuel/chapitre-01-connexion-securite-et-navigation.docx
@@ -322,7 +322,7 @@
                 <w:sz w:val="20"/>
                 <w:szCs w:val="20"/>
               </w:rPr>
-              <w:t xml:space="preserve">2.101.433</w:t>
+              <w:t xml:space="preserve">2.101.434</w:t>
             </w:r>
           </w:p>
         </w:tc>
@@ -8570,7 +8570,7 @@
         <w:sz w:val="14"/>
         <w:szCs w:val="14"/>
       </w:rPr>
-      <w:t xml:space="preserve">Version 2.101.433 de l'application  ·  1er octobre 2026  ·  document interne BMI Togo</w:t>
+      <w:t xml:space="preserve">Version 2.101.434 de l'application  ·  1er octobre 2026  ·  document interne BMI Togo</w:t>
     </w:r>
   </w:p>
 </w:ftr>

</xml_diff>

<commit_message>
2.101.435 — 🧾 Bulletin de paie : le vrai rôle, matricule, n° d'assuré, date d'embauche, banque (compte masqué)
Le bulletin écrivait « Vendeur » pour un comptable ou un responsable
commercial ; il lit désormais LIBELLE_ROLE_EMPLOYE. Il imprime ce que la
fiche de paie porte déjà, une ligne vide n'apparaît pas. Banc : 4 contrôles,
le bulletin imprimé par un témoin, éprouvé. Chapitre 18 à jour.

Co-Authored-By: Claude Opus 5.5 <noreply@anthropic.com>
Claude-Session: https://claude.ai/code/session_01V9FfE1ccQN1sKVjUyrAC9z
</commit_message>
<xml_diff>
--- a/docs/manuel/chapitre-01-connexion-securite-et-navigation.docx
+++ b/docs/manuel/chapitre-01-connexion-securite-et-navigation.docx
@@ -322,7 +322,7 @@
                 <w:sz w:val="20"/>
                 <w:szCs w:val="20"/>
               </w:rPr>
-              <w:t xml:space="preserve">2.101.434</w:t>
+              <w:t xml:space="preserve">2.101.435</w:t>
             </w:r>
           </w:p>
         </w:tc>
@@ -8570,7 +8570,7 @@
         <w:sz w:val="14"/>
         <w:szCs w:val="14"/>
       </w:rPr>
-      <w:t xml:space="preserve">Version 2.101.434 de l'application  ·  1er octobre 2026  ·  document interne BMI Togo</w:t>
+      <w:t xml:space="preserve">Version 2.101.435 de l'application  ·  1er octobre 2026  ·  document interne BMI Togo</w:t>
     </w:r>
   </w:p>
 </w:ftr>

</xml_diff>

<commit_message>
Bulletin de paie, niveau 2 : colonnes Gains / Retenues, brut, base CNSS, totaux, cumuls de l'année (2.101.436)
- imprimerBulletin : deux colonnes, ligne TOTAUX, net ; salaire brut (sans
  les remboursements de frais), base CNSS (« Non assujetti »), total gains
  et retenues ; cumuls de l'année depuis le 1er janvier ou le premier mois suivi.
- cumulsPaieAnnee (calculs.js), règle pure sur paieMois.
- Banc : 4 contrôles de plus, éprouvés en remettant chaque faute.
- Chapitre 18 du manuel à jour, manuel refait.

Co-Authored-By: Claude Opus 5.5 <noreply@anthropic.com>
Claude-Session: https://claude.ai/code/session_01V9FfE1ccQN1sKVjUyrAC9z
</commit_message>
<xml_diff>
--- a/docs/manuel/chapitre-01-connexion-securite-et-navigation.docx
+++ b/docs/manuel/chapitre-01-connexion-securite-et-navigation.docx
@@ -322,7 +322,7 @@
                 <w:sz w:val="20"/>
                 <w:szCs w:val="20"/>
               </w:rPr>
-              <w:t xml:space="preserve">2.101.435</w:t>
+              <w:t xml:space="preserve">2.101.436</w:t>
             </w:r>
           </w:p>
         </w:tc>
@@ -8570,7 +8570,7 @@
         <w:sz w:val="14"/>
         <w:szCs w:val="14"/>
       </w:rPr>
-      <w:t xml:space="preserve">Version 2.101.435 de l'application  ·  1er octobre 2026  ·  document interne BMI Togo</w:t>
+      <w:t xml:space="preserve">Version 2.101.436 de l'application  ·  1er octobre 2026  ·  document interne BMI Togo</w:t>
     </w:r>
   </w:p>
 </w:ftr>

</xml_diff>

<commit_message>
Date d'embauche saisissable pour tout salarié (2.101.437)
- 👥 Utilisateurs → ⋯ Gérer → Paie : bouton « 📅 Embauche » (administrateur
  revérifié), même champ cnss_date_embauche.
- 💵 Salaires → 🏦 CNSS : la case Date d'embauche n'est plus grisée pour un
  employé non assujetti.
- Banc : 2 contrôles éprouvés, un retourné (demanderDate ×7).
- Chapitres 2 et 18 du manuel à jour, manuel refait.

Co-Authored-By: Claude Opus 5.5 <noreply@anthropic.com>
Claude-Session: https://claude.ai/code/session_01V9FfE1ccQN1sKVjUyrAC9z
</commit_message>
<xml_diff>
--- a/docs/manuel/chapitre-01-connexion-securite-et-navigation.docx
+++ b/docs/manuel/chapitre-01-connexion-securite-et-navigation.docx
@@ -322,7 +322,7 @@
                 <w:sz w:val="20"/>
                 <w:szCs w:val="20"/>
               </w:rPr>
-              <w:t xml:space="preserve">2.101.436</w:t>
+              <w:t xml:space="preserve">2.101.437</w:t>
             </w:r>
           </w:p>
         </w:tc>
@@ -8570,7 +8570,7 @@
         <w:sz w:val="14"/>
         <w:szCs w:val="14"/>
       </w:rPr>
-      <w:t xml:space="preserve">Version 2.101.436 de l'application  ·  1er octobre 2026  ·  document interne BMI Togo</w:t>
+      <w:t xml:space="preserve">Version 2.101.437 de l'application  ·  1er octobre 2026  ·  document interne BMI Togo</w:t>
     </w:r>
   </w:p>
 </w:ftr>

</xml_diff>